<commit_message>
fix: correct spelling of 'résumé' to 'resume' in index.html
</commit_message>
<xml_diff>
--- a/assets/resume/Vajid_Shaik_DevOps_Engineer_Resume.docx
+++ b/assets/resume/Vajid_Shaik_DevOps_Engineer_Resume.docx
@@ -4,65 +4,267 @@
   <w:body>
     <w:p>
       <w:pPr>
-        <w:spacing w:after="50" w:line="245" w:lineRule="auto"/>
+        <w:spacing w:after="0"/>
       </w:pPr>
       <w:r>
         <w:rPr>
           <w:rFonts w:ascii="Arial" w:hAnsi="Arial"/>
           <w:b/>
           <w:color w:val="111111"/>
-          <w:sz w:val="50"/>
+          <w:sz w:val="54"/>
         </w:rPr>
-        <w:t>Vajid Shaik</w:t>
+        <w:t>VAJID SHAIK</w:t>
       </w:r>
     </w:p>
     <w:p>
       <w:pPr>
-        <w:spacing w:after="50" w:line="245" w:lineRule="auto"/>
+        <w:spacing w:after="100"/>
       </w:pPr>
       <w:r>
         <w:rPr>
           <w:rFonts w:ascii="Arial" w:hAnsi="Arial"/>
           <w:b/>
           <w:color w:val="111111"/>
-          <w:sz w:val="22"/>
+          <w:sz w:val="24"/>
         </w:rPr>
         <w:t>DEVOPS ENGINEER</w:t>
       </w:r>
     </w:p>
     <w:p>
       <w:pPr>
-        <w:spacing w:after="50" w:line="245" w:lineRule="auto"/>
+        <w:spacing w:after="20"/>
       </w:pPr>
       <w:r>
         <w:rPr>
           <w:rFonts w:ascii="Arial" w:hAnsi="Arial"/>
+          <w:b w:val="0"/>
           <w:color w:val="111111"/>
-          <w:sz w:val="18"/>
+          <w:sz w:val="19"/>
         </w:rPr>
         <w:t>Hyderabad, India  |  +91 9640781856  |  shaikvajid484@gmail.com</w:t>
       </w:r>
     </w:p>
     <w:p>
       <w:pPr>
-        <w:spacing w:after="50" w:line="245" w:lineRule="auto"/>
+        <w:spacing w:after="20"/>
       </w:pPr>
       <w:r>
         <w:rPr>
           <w:rFonts w:ascii="Arial" w:hAnsi="Arial"/>
+          <w:b w:val="0"/>
           <w:color w:val="111111"/>
-          <w:sz w:val="18"/>
+          <w:sz w:val="19"/>
         </w:rPr>
-        <w:t>linkedin.com/in/vajid-shaik  |  github.com/VajidShaik44  |  vajidshaik44.github.io</w:t>
+        <w:t>LinkedIn: linkedin.com/in/vajid-shaik  |  GitHub: github.com/VajidShaik44  |  Portfolio: vajidshaik44.github.io</w:t>
       </w:r>
     </w:p>
     <w:p>
       <w:pPr>
         <w:keepNext/>
-        <w:spacing w:before="120" w:after="50" w:line="245" w:lineRule="auto"/>
+        <w:spacing w:before="160" w:after="60"/>
         <w:pBdr>
-          <w:bottom w:val="single" w:sz="4" w:space="1" w:color="DCE6E0"/>
+          <w:bottom w:val="single" w:sz="5" w:space="2" w:color="777777"/>
         </w:pBdr>
+      </w:pPr>
+      <w:r>
+        <w:rPr>
+          <w:rFonts w:ascii="Arial" w:hAnsi="Arial"/>
+          <w:b/>
+          <w:color w:val="111111"/>
+          <w:sz w:val="23"/>
+        </w:rPr>
+        <w:t>PROFESSIONAL SUMMARY</w:t>
+      </w:r>
+    </w:p>
+    <w:p>
+      <w:r>
+        <w:rPr>
+          <w:rFonts w:ascii="Arial" w:hAnsi="Arial"/>
+          <w:b w:val="0"/>
+          <w:color w:val="111111"/>
+          <w:sz w:val="20"/>
+        </w:rPr>
+        <w:t>DevOps Engineer with hands-on experience building CI/CD workflows for multi-service Java applications and supporting AWS infrastructure and Linux deployments. Automated build-to-deployment workflows, reducing deployment time by 70%. Skilled in GitHub Actions, Jenkins, AWS, Terraform, Docker, Kubernetes, and production operations.</w:t>
+      </w:r>
+    </w:p>
+    <w:p>
+      <w:pPr>
+        <w:keepNext/>
+        <w:spacing w:before="160" w:after="60"/>
+        <w:pBdr>
+          <w:bottom w:val="single" w:sz="5" w:space="2" w:color="777777"/>
+        </w:pBdr>
+      </w:pPr>
+      <w:r>
+        <w:rPr>
+          <w:rFonts w:ascii="Arial" w:hAnsi="Arial"/>
+          <w:b/>
+          <w:color w:val="111111"/>
+          <w:sz w:val="23"/>
+        </w:rPr>
+        <w:t>TECHNICAL SKILLS</w:t>
+      </w:r>
+    </w:p>
+    <w:p>
+      <w:pPr>
+        <w:spacing w:after="30"/>
+      </w:pPr>
+      <w:r>
+        <w:rPr>
+          <w:rFonts w:ascii="Arial" w:hAnsi="Arial"/>
+          <w:b/>
+          <w:color w:val="111111"/>
+          <w:sz w:val="19"/>
+        </w:rPr>
+        <w:t xml:space="preserve">Cloud and networking: </w:t>
+      </w:r>
+      <w:r>
+        <w:rPr>
+          <w:rFonts w:ascii="Arial" w:hAnsi="Arial"/>
+          <w:b w:val="0"/>
+          <w:color w:val="111111"/>
+          <w:sz w:val="19"/>
+        </w:rPr>
+        <w:t>AWS (EC2, S3, IAM, VPC, Security Groups), Nginx, SSL, load balancing</w:t>
+      </w:r>
+    </w:p>
+    <w:p>
+      <w:pPr>
+        <w:spacing w:after="30"/>
+      </w:pPr>
+      <w:r>
+        <w:rPr>
+          <w:rFonts w:ascii="Arial" w:hAnsi="Arial"/>
+          <w:b/>
+          <w:color w:val="111111"/>
+          <w:sz w:val="19"/>
+        </w:rPr>
+        <w:t xml:space="preserve">CI/CD: </w:t>
+      </w:r>
+      <w:r>
+        <w:rPr>
+          <w:rFonts w:ascii="Arial" w:hAnsi="Arial"/>
+          <w:b w:val="0"/>
+          <w:color w:val="111111"/>
+          <w:sz w:val="19"/>
+        </w:rPr>
+        <w:t>GitHub Actions, Jenkins, build automation, artifact storage and deployment workflows</w:t>
+      </w:r>
+    </w:p>
+    <w:p>
+      <w:pPr>
+        <w:spacing w:after="30"/>
+      </w:pPr>
+      <w:r>
+        <w:rPr>
+          <w:rFonts w:ascii="Arial" w:hAnsi="Arial"/>
+          <w:b/>
+          <w:color w:val="111111"/>
+          <w:sz w:val="19"/>
+        </w:rPr>
+        <w:t xml:space="preserve">Infrastructure as code: </w:t>
+      </w:r>
+      <w:r>
+        <w:rPr>
+          <w:rFonts w:ascii="Arial" w:hAnsi="Arial"/>
+          <w:b w:val="0"/>
+          <w:color w:val="111111"/>
+          <w:sz w:val="19"/>
+        </w:rPr>
+        <w:t>Terraform, Ansible, version-controlled infrastructure</w:t>
+      </w:r>
+    </w:p>
+    <w:p>
+      <w:pPr>
+        <w:spacing w:after="30"/>
+      </w:pPr>
+      <w:r>
+        <w:rPr>
+          <w:rFonts w:ascii="Arial" w:hAnsi="Arial"/>
+          <w:b/>
+          <w:color w:val="111111"/>
+          <w:sz w:val="19"/>
+        </w:rPr>
+        <w:t xml:space="preserve">Containers and orchestration: </w:t>
+      </w:r>
+      <w:r>
+        <w:rPr>
+          <w:rFonts w:ascii="Arial" w:hAnsi="Arial"/>
+          <w:b w:val="0"/>
+          <w:color w:val="111111"/>
+          <w:sz w:val="19"/>
+        </w:rPr>
+        <w:t>Docker, Kubernetes, Deployments, Services, Ingress, rolling updates, replica scaling</w:t>
+      </w:r>
+    </w:p>
+    <w:p>
+      <w:pPr>
+        <w:spacing w:after="30"/>
+      </w:pPr>
+      <w:r>
+        <w:rPr>
+          <w:rFonts w:ascii="Arial" w:hAnsi="Arial"/>
+          <w:b/>
+          <w:color w:val="111111"/>
+          <w:sz w:val="19"/>
+        </w:rPr>
+        <w:t xml:space="preserve">Systems and scripting: </w:t>
+      </w:r>
+      <w:r>
+        <w:rPr>
+          <w:rFonts w:ascii="Arial" w:hAnsi="Arial"/>
+          <w:b w:val="0"/>
+          <w:color w:val="111111"/>
+          <w:sz w:val="19"/>
+        </w:rPr>
+        <w:t>Linux (Ubuntu), Bash, systemd, Git</w:t>
+      </w:r>
+    </w:p>
+    <w:p>
+      <w:pPr>
+        <w:spacing w:after="30"/>
+      </w:pPr>
+      <w:r>
+        <w:rPr>
+          <w:rFonts w:ascii="Arial" w:hAnsi="Arial"/>
+          <w:b/>
+          <w:color w:val="111111"/>
+          <w:sz w:val="19"/>
+        </w:rPr>
+        <w:t xml:space="preserve">Data and monitoring: </w:t>
+      </w:r>
+      <w:r>
+        <w:rPr>
+          <w:rFonts w:ascii="Arial" w:hAnsi="Arial"/>
+          <w:b w:val="0"/>
+          <w:color w:val="111111"/>
+          <w:sz w:val="19"/>
+        </w:rPr>
+        <w:t>MySQL, MongoDB, Redis, log monitoring, Prometheus, Grafana</w:t>
+      </w:r>
+    </w:p>
+    <w:p>
+      <w:pPr>
+        <w:keepNext/>
+        <w:spacing w:before="160" w:after="60"/>
+        <w:pBdr>
+          <w:bottom w:val="single" w:sz="5" w:space="2" w:color="777777"/>
+        </w:pBdr>
+      </w:pPr>
+      <w:r>
+        <w:rPr>
+          <w:rFonts w:ascii="Arial" w:hAnsi="Arial"/>
+          <w:b/>
+          <w:color w:val="111111"/>
+          <w:sz w:val="23"/>
+        </w:rPr>
+        <w:t>PROFESSIONAL EXPERIENCE</w:t>
+      </w:r>
+    </w:p>
+    <w:p>
+      <w:pPr>
+        <w:keepNext/>
+        <w:spacing w:after="20"/>
       </w:pPr>
       <w:r>
         <w:rPr>
@@ -71,28 +273,120 @@
           <w:color w:val="111111"/>
           <w:sz w:val="21"/>
         </w:rPr>
-        <w:t>PROFESSIONAL SUMMARY</w:t>
-      </w:r>
-    </w:p>
-    <w:p>
-      <w:pPr>
-        <w:spacing w:line="245" w:lineRule="auto" w:after="50"/>
-      </w:pPr>
-      <w:r>
-        <w:rPr>
-          <w:rFonts w:ascii="Arial" w:hAnsi="Arial"/>
-          <w:color w:val="111111"/>
-          <w:sz w:val="18"/>
-        </w:rPr>
-        <w:t>DevOps Engineer with hands-on experience supporting CI/CD for multi-service Java applications, AWS infrastructure, and Linux-based deployments. Automated build-to-deployment workflows and reduced deployment time by 70%. Experienced with GitHub Actions, Jenkins, Terraform, Docker, Kubernetes, Nginx, and production troubleshooting.</w:t>
+        <w:t>DevOps Engineer (previously Trainee DevOps Engineer)</w:t>
       </w:r>
     </w:p>
     <w:p>
       <w:pPr>
         <w:keepNext/>
-        <w:spacing w:before="120" w:after="50" w:line="245" w:lineRule="auto"/>
+        <w:spacing w:after="80"/>
+      </w:pPr>
+      <w:r>
+        <w:rPr>
+          <w:rFonts w:ascii="Arial" w:hAnsi="Arial"/>
+          <w:b w:val="0"/>
+          <w:color w:val="111111"/>
+          <w:sz w:val="19"/>
+        </w:rPr>
+        <w:t>Zerocode Innovations Pvt Ltd  |  Hyderabad, India  |  Dec 2024 - Present</w:t>
+      </w:r>
+    </w:p>
+    <w:p>
+      <w:pPr>
+        <w:spacing w:after="52" w:line="250" w:lineRule="auto"/>
+        <w:ind w:left="288" w:hanging="259"/>
+      </w:pPr>
+      <w:r>
+        <w:rPr>
+          <w:rFonts w:ascii="Arial" w:hAnsi="Arial"/>
+          <w:b w:val="0"/>
+          <w:color w:val="111111"/>
+          <w:sz w:val="19"/>
+        </w:rPr>
+        <w:t>- Build and maintain GitHub Actions and Jenkins pipelines for multi-service Java WAR applications, automating builds, artifact storage in Amazon S3, and deployments across multiple servers.</w:t>
+      </w:r>
+    </w:p>
+    <w:p>
+      <w:pPr>
+        <w:spacing w:after="52" w:line="250" w:lineRule="auto"/>
+        <w:ind w:left="288" w:hanging="259"/>
+      </w:pPr>
+      <w:r>
+        <w:rPr>
+          <w:rFonts w:ascii="Arial" w:hAnsi="Arial"/>
+          <w:b w:val="0"/>
+          <w:color w:val="111111"/>
+          <w:sz w:val="19"/>
+        </w:rPr>
+        <w:t>- Automated the build-to-deployment workflow, reducing deployment time by 70% and minimizing manual configuration errors.</w:t>
+      </w:r>
+    </w:p>
+    <w:p>
+      <w:pPr>
+        <w:spacing w:after="52" w:line="250" w:lineRule="auto"/>
+        <w:ind w:left="288" w:hanging="259"/>
+      </w:pPr>
+      <w:r>
+        <w:rPr>
+          <w:rFonts w:ascii="Arial" w:hAnsi="Arial"/>
+          <w:b w:val="0"/>
+          <w:color w:val="111111"/>
+          <w:sz w:val="19"/>
+        </w:rPr>
+        <w:t>- Manage AWS infrastructure including EC2, S3, IAM, VPC, and Security Groups; maintain repeatable provisioning with version-controlled Terraform configurations.</w:t>
+      </w:r>
+    </w:p>
+    <w:p>
+      <w:pPr>
+        <w:spacing w:after="52" w:line="250" w:lineRule="auto"/>
+        <w:ind w:left="288" w:hanging="259"/>
+      </w:pPr>
+      <w:r>
+        <w:rPr>
+          <w:rFonts w:ascii="Arial" w:hAnsi="Arial"/>
+          <w:b w:val="0"/>
+          <w:color w:val="111111"/>
+          <w:sz w:val="19"/>
+        </w:rPr>
+        <w:t>- Configure Nginx reverse proxy, SSL, and load balancing; support Linux deployments and services using Bash and systemd.</w:t>
+      </w:r>
+    </w:p>
+    <w:p>
+      <w:pPr>
+        <w:spacing w:after="52" w:line="250" w:lineRule="auto"/>
+        <w:ind w:left="288" w:hanging="259"/>
+      </w:pPr>
+      <w:r>
+        <w:rPr>
+          <w:rFonts w:ascii="Arial" w:hAnsi="Arial"/>
+          <w:b w:val="0"/>
+          <w:color w:val="111111"/>
+          <w:sz w:val="19"/>
+        </w:rPr>
+        <w:t>- Containerize applications with Docker and deploy workloads to Kubernetes using Deployments, Services, and Ingress; perform rolling updates and replica scaling.</w:t>
+      </w:r>
+    </w:p>
+    <w:p>
+      <w:pPr>
+        <w:spacing w:after="52" w:line="250" w:lineRule="auto"/>
+        <w:ind w:left="288" w:hanging="259"/>
+      </w:pPr>
+      <w:r>
+        <w:rPr>
+          <w:rFonts w:ascii="Arial" w:hAnsi="Arial"/>
+          <w:b w:val="0"/>
+          <w:color w:val="111111"/>
+          <w:sz w:val="19"/>
+        </w:rPr>
+        <w:t>- Administer MySQL, MongoDB, and Redis in staging and production; monitor logs and troubleshoot deployment and application issues.</w:t>
+      </w:r>
+    </w:p>
+    <w:p>
+      <w:pPr>
+        <w:keepNext/>
+        <w:spacing w:before="160" w:after="60"/>
         <w:pBdr>
-          <w:bottom w:val="single" w:sz="4" w:space="1" w:color="DCE6E0"/>
+          <w:bottom w:val="single" w:sz="5" w:space="2" w:color="777777"/>
         </w:pBdr>
       </w:pPr>
       <w:r>
@@ -100,149 +394,122 @@
           <w:rFonts w:ascii="Arial" w:hAnsi="Arial"/>
           <w:b/>
           <w:color w:val="111111"/>
-          <w:sz w:val="21"/>
+          <w:sz w:val="23"/>
         </w:rPr>
-        <w:t>TECHNICAL SKILLS</w:t>
+        <w:t>PROJECTS</w:t>
       </w:r>
     </w:p>
     <w:p>
       <w:pPr>
-        <w:spacing w:after="50" w:line="245" w:lineRule="auto"/>
+        <w:keepNext/>
+        <w:spacing w:before="60" w:after="40"/>
       </w:pPr>
       <w:r>
         <w:rPr>
           <w:rFonts w:ascii="Arial" w:hAnsi="Arial"/>
           <w:b/>
           <w:color w:val="111111"/>
-          <w:sz w:val="18"/>
+          <w:sz w:val="20"/>
         </w:rPr>
-        <w:t xml:space="preserve">Cloud and networking: </w:t>
-      </w:r>
-      <w:r>
-        <w:rPr>
-          <w:rFonts w:ascii="Arial" w:hAnsi="Arial"/>
-          <w:color w:val="111111"/>
-          <w:sz w:val="18"/>
-        </w:rPr>
-        <w:t>AWS (EC2, S3, IAM, VPC, Security Groups), Nginx, SSL, load balancing</w:t>
+        <w:t>BlogCMS - Full-stack application deployment | Go, Vue.js, MySQL, Nginx, Ubuntu Linux</w:t>
       </w:r>
     </w:p>
     <w:p>
       <w:pPr>
-        <w:spacing w:after="50" w:line="245" w:lineRule="auto"/>
+        <w:spacing w:after="52" w:line="250" w:lineRule="auto"/>
+        <w:ind w:left="288" w:hanging="259"/>
+      </w:pPr>
+      <w:r>
+        <w:rPr>
+          <w:rFonts w:ascii="Arial" w:hAnsi="Arial"/>
+          <w:b w:val="0"/>
+          <w:color w:val="111111"/>
+          <w:sz w:val="19"/>
+        </w:rPr>
+        <w:t>- Deployed the Go API and Vue frontend to an Ubuntu VPS; configured Nginx to serve the static frontend and reverse-proxy API traffic.</w:t>
+      </w:r>
+    </w:p>
+    <w:p>
+      <w:pPr>
+        <w:spacing w:after="52" w:line="250" w:lineRule="auto"/>
+        <w:ind w:left="288" w:hanging="259"/>
+      </w:pPr>
+      <w:r>
+        <w:rPr>
+          <w:rFonts w:ascii="Arial" w:hAnsi="Arial"/>
+          <w:b w:val="0"/>
+          <w:color w:val="111111"/>
+          <w:sz w:val="19"/>
+        </w:rPr>
+        <w:t>- Managed the API with systemd, configured HTTPS with Let's Encrypt, and operated the MySQL-backed application.</w:t>
+      </w:r>
+    </w:p>
+    <w:p>
+      <w:pPr>
+        <w:keepNext/>
+        <w:spacing w:before="60" w:after="40"/>
       </w:pPr>
       <w:r>
         <w:rPr>
           <w:rFonts w:ascii="Arial" w:hAnsi="Arial"/>
           <w:b/>
           <w:color w:val="111111"/>
-          <w:sz w:val="18"/>
+          <w:sz w:val="20"/>
         </w:rPr>
-        <w:t xml:space="preserve">CI/CD and automation: </w:t>
-      </w:r>
-      <w:r>
-        <w:rPr>
-          <w:rFonts w:ascii="Arial" w:hAnsi="Arial"/>
-          <w:color w:val="111111"/>
-          <w:sz w:val="18"/>
-        </w:rPr>
-        <w:t>GitHub Actions, Jenkins, Bash, systemd</w:t>
+        <w:t>Kubernetes application deployment | Docker, Kubernetes, YAML, kubectl</w:t>
       </w:r>
     </w:p>
     <w:p>
       <w:pPr>
-        <w:spacing w:after="50" w:line="245" w:lineRule="auto"/>
+        <w:spacing w:after="52" w:line="250" w:lineRule="auto"/>
+        <w:ind w:left="288" w:hanging="259"/>
+      </w:pPr>
+      <w:r>
+        <w:rPr>
+          <w:rFonts w:ascii="Arial" w:hAnsi="Arial"/>
+          <w:b w:val="0"/>
+          <w:color w:val="111111"/>
+          <w:sz w:val="19"/>
+        </w:rPr>
+        <w:t>- Deployed a containerized application to Kubernetes using Deployments, Services, and Ingress; configured rolling updates and replica scaling and verified pod recovery behavior.</w:t>
+      </w:r>
+    </w:p>
+    <w:p>
+      <w:pPr>
+        <w:keepNext/>
+        <w:spacing w:before="60" w:after="40"/>
       </w:pPr>
       <w:r>
         <w:rPr>
           <w:rFonts w:ascii="Arial" w:hAnsi="Arial"/>
           <w:b/>
           <w:color w:val="111111"/>
-          <w:sz w:val="18"/>
+          <w:sz w:val="20"/>
         </w:rPr>
-        <w:t xml:space="preserve">Infrastructure as code: </w:t>
-      </w:r>
-      <w:r>
-        <w:rPr>
-          <w:rFonts w:ascii="Arial" w:hAnsi="Arial"/>
-          <w:color w:val="111111"/>
-          <w:sz w:val="18"/>
-        </w:rPr>
-        <w:t>Terraform, Ansible</w:t>
+        <w:t>AWS DevOps automation projects | AWS, Terraform, Jenkins, GitHub Actions, Prometheus, Grafana</w:t>
       </w:r>
     </w:p>
     <w:p>
       <w:pPr>
-        <w:spacing w:after="50" w:line="245" w:lineRule="auto"/>
+        <w:spacing w:after="52" w:line="250" w:lineRule="auto"/>
+        <w:ind w:left="288" w:hanging="259"/>
       </w:pPr>
       <w:r>
         <w:rPr>
           <w:rFonts w:ascii="Arial" w:hAnsi="Arial"/>
-          <w:b/>
+          <w:b w:val="0"/>
           <w:color w:val="111111"/>
-          <w:sz w:val="18"/>
+          <w:sz w:val="19"/>
         </w:rPr>
-        <w:t xml:space="preserve">Containers and orchestration: </w:t>
-      </w:r>
-      <w:r>
-        <w:rPr>
-          <w:rFonts w:ascii="Arial" w:hAnsi="Arial"/>
-          <w:color w:val="111111"/>
-          <w:sz w:val="18"/>
-        </w:rPr>
-        <w:t>Docker, Kubernetes (Pods, Deployments, Services, Ingress, rolling updates, basic HPA)</w:t>
-      </w:r>
-    </w:p>
-    <w:p>
-      <w:pPr>
-        <w:spacing w:after="50" w:line="245" w:lineRule="auto"/>
-      </w:pPr>
-      <w:r>
-        <w:rPr>
-          <w:rFonts w:ascii="Arial" w:hAnsi="Arial"/>
-          <w:b/>
-          <w:color w:val="111111"/>
-          <w:sz w:val="18"/>
-        </w:rPr>
-        <w:t xml:space="preserve">Databases and operations: </w:t>
-      </w:r>
-      <w:r>
-        <w:rPr>
-          <w:rFonts w:ascii="Arial" w:hAnsi="Arial"/>
-          <w:color w:val="111111"/>
-          <w:sz w:val="18"/>
-        </w:rPr>
-        <w:t>MySQL, MongoDB, Redis, Linux (Ubuntu), Git, log monitoring and production troubleshooting</w:t>
-      </w:r>
-    </w:p>
-    <w:p>
-      <w:pPr>
-        <w:spacing w:after="50" w:line="245" w:lineRule="auto"/>
-      </w:pPr>
-      <w:r>
-        <w:rPr>
-          <w:rFonts w:ascii="Arial" w:hAnsi="Arial"/>
-          <w:b/>
-          <w:color w:val="111111"/>
-          <w:sz w:val="18"/>
-        </w:rPr>
-        <w:t xml:space="preserve">Monitoring: </w:t>
-      </w:r>
-      <w:r>
-        <w:rPr>
-          <w:rFonts w:ascii="Arial" w:hAnsi="Arial"/>
-          <w:color w:val="111111"/>
-          <w:sz w:val="18"/>
-        </w:rPr>
-        <w:t>Prometheus, Grafana</w:t>
+        <w:t>- Hands-on project repository covering AWS VPC automation, Jenkins high availability, container deployment, observability, and GitHub Actions OIDC authentication.</w:t>
       </w:r>
     </w:p>
     <w:p>
       <w:pPr>
         <w:keepNext/>
-        <w:spacing w:before="120" w:after="50" w:line="245" w:lineRule="auto"/>
+        <w:spacing w:before="160" w:after="60"/>
         <w:pBdr>
-          <w:bottom w:val="single" w:sz="4" w:space="1" w:color="DCE6E0"/>
+          <w:bottom w:val="single" w:sz="5" w:space="2" w:color="777777"/>
         </w:pBdr>
       </w:pPr>
       <w:r>
@@ -250,266 +517,34 @@
           <w:rFonts w:ascii="Arial" w:hAnsi="Arial"/>
           <w:b/>
           <w:color w:val="111111"/>
-          <w:sz w:val="21"/>
+          <w:sz w:val="23"/>
         </w:rPr>
-        <w:t>PROFESSIONAL EXPERIENCE</w:t>
+        <w:t>EDUCATION</w:t>
       </w:r>
     </w:p>
     <w:p>
-      <w:pPr>
-        <w:keepNext/>
-        <w:spacing w:after="50" w:line="245" w:lineRule="auto"/>
-      </w:pPr>
       <w:r>
         <w:rPr>
           <w:rFonts w:ascii="Arial" w:hAnsi="Arial"/>
           <w:b/>
           <w:color w:val="111111"/>
-          <w:sz w:val="19"/>
-        </w:rPr>
-        <w:t>DevOps Engineer (previously Trainee DevOps Engineer)</w:t>
-      </w:r>
-    </w:p>
-    <w:p>
-      <w:pPr>
-        <w:keepNext/>
-        <w:spacing w:after="50" w:line="245" w:lineRule="auto"/>
-      </w:pPr>
-      <w:r>
-        <w:rPr>
-          <w:rFonts w:ascii="Arial" w:hAnsi="Arial"/>
-          <w:color w:val="111111"/>
-          <w:sz w:val="18"/>
-        </w:rPr>
-        <w:t>Zerocode Innovations Pvt Ltd | Hyderabad, India | Dec 2024 - Present</w:t>
-      </w:r>
-    </w:p>
-    <w:p>
-      <w:pPr>
-        <w:pStyle w:val="ListBullet"/>
-        <w:spacing w:after="40" w:line="245" w:lineRule="auto"/>
-        <w:ind w:left="259" w:hanging="173"/>
-      </w:pPr>
-      <w:r>
-        <w:rPr>
-          <w:rFonts w:ascii="Arial" w:hAnsi="Arial"/>
-          <w:color w:val="111111"/>
-          <w:sz w:val="18"/>
-        </w:rPr>
-        <w:t>Build and maintain GitHub Actions and Jenkins pipelines for multi-service Java WAR applications, automating builds, artifact storage in Amazon S3, and deployments across multiple servers.</w:t>
-      </w:r>
-    </w:p>
-    <w:p>
-      <w:pPr>
-        <w:pStyle w:val="ListBullet"/>
-        <w:spacing w:after="40" w:line="245" w:lineRule="auto"/>
-        <w:ind w:left="259" w:hanging="173"/>
-      </w:pPr>
-      <w:r>
-        <w:rPr>
-          <w:rFonts w:ascii="Arial" w:hAnsi="Arial"/>
-          <w:color w:val="111111"/>
-          <w:sz w:val="18"/>
-        </w:rPr>
-        <w:t>Automated the build-to-deployment workflow, reducing deployment time by 70% and minimizing manual configuration errors.</w:t>
-      </w:r>
-    </w:p>
-    <w:p>
-      <w:pPr>
-        <w:pStyle w:val="ListBullet"/>
-        <w:spacing w:after="40" w:line="245" w:lineRule="auto"/>
-        <w:ind w:left="259" w:hanging="173"/>
-      </w:pPr>
-      <w:r>
-        <w:rPr>
-          <w:rFonts w:ascii="Arial" w:hAnsi="Arial"/>
-          <w:color w:val="111111"/>
-          <w:sz w:val="18"/>
-        </w:rPr>
-        <w:t>Manage AWS resources including EC2, S3, IAM, VPC, and Security Groups to support application environments.</w:t>
-      </w:r>
-    </w:p>
-    <w:p>
-      <w:pPr>
-        <w:pStyle w:val="ListBullet"/>
-        <w:spacing w:after="40" w:line="245" w:lineRule="auto"/>
-        <w:ind w:left="259" w:hanging="173"/>
-      </w:pPr>
-      <w:r>
-        <w:rPr>
-          <w:rFonts w:ascii="Arial" w:hAnsi="Arial"/>
-          <w:color w:val="111111"/>
-          <w:sz w:val="18"/>
-        </w:rPr>
-        <w:t>Configure Nginx reverse proxy, SSL, and load balancing; support Linux deployments and service operations with Bash and systemd.</w:t>
-      </w:r>
-    </w:p>
-    <w:p>
-      <w:pPr>
-        <w:pStyle w:val="ListBullet"/>
-        <w:spacing w:after="40" w:line="245" w:lineRule="auto"/>
-        <w:ind w:left="259" w:hanging="173"/>
-      </w:pPr>
-      <w:r>
-        <w:rPr>
-          <w:rFonts w:ascii="Arial" w:hAnsi="Arial"/>
-          <w:color w:val="111111"/>
-          <w:sz w:val="18"/>
-        </w:rPr>
-        <w:t>Containerize applications with Docker and deploy workloads to Kubernetes using Deployments, Services, and Ingress; use rolling updates and replica scaling.</w:t>
-      </w:r>
-    </w:p>
-    <w:p>
-      <w:pPr>
-        <w:pStyle w:val="ListBullet"/>
-        <w:spacing w:after="40" w:line="245" w:lineRule="auto"/>
-        <w:ind w:left="259" w:hanging="173"/>
-      </w:pPr>
-      <w:r>
-        <w:rPr>
-          <w:rFonts w:ascii="Arial" w:hAnsi="Arial"/>
-          <w:color w:val="111111"/>
-          <w:sz w:val="18"/>
-        </w:rPr>
-        <w:t>Administer MySQL, MongoDB, and Redis in staging and production; monitor logs and troubleshoot deployment and application issues.</w:t>
-      </w:r>
-    </w:p>
-    <w:p>
-      <w:pPr>
-        <w:keepNext/>
-        <w:spacing w:before="120" w:after="50" w:line="245" w:lineRule="auto"/>
-        <w:pBdr>
-          <w:bottom w:val="single" w:sz="4" w:space="1" w:color="DCE6E0"/>
-        </w:pBdr>
-      </w:pPr>
-      <w:r>
-        <w:rPr>
-          <w:rFonts w:ascii="Arial" w:hAnsi="Arial"/>
-          <w:b/>
-          <w:color w:val="111111"/>
-          <w:sz w:val="21"/>
-        </w:rPr>
-        <w:t>PROJECTS</w:t>
-      </w:r>
-    </w:p>
-    <w:p>
-      <w:pPr>
-        <w:keepNext/>
-        <w:spacing w:before="40" w:after="50" w:line="245" w:lineRule="auto"/>
-      </w:pPr>
-      <w:r>
-        <w:rPr>
-          <w:rFonts w:ascii="Arial" w:hAnsi="Arial"/>
-          <w:b/>
-          <w:color w:val="111111"/>
-          <w:sz w:val="19"/>
-        </w:rPr>
-        <w:t>BlogCMS | Production deployment | Go, Vue.js, MySQL, Nginx, Linux</w:t>
-      </w:r>
-    </w:p>
-    <w:p>
-      <w:pPr>
-        <w:pStyle w:val="ListBullet"/>
-        <w:spacing w:after="40" w:line="245" w:lineRule="auto"/>
-        <w:ind w:left="259" w:hanging="173"/>
-      </w:pPr>
-      <w:r>
-        <w:rPr>
-          <w:rFonts w:ascii="Arial" w:hAnsi="Arial"/>
-          <w:color w:val="111111"/>
-          <w:sz w:val="18"/>
-        </w:rPr>
-        <w:t>Deployed a full-stack content management system to an Ubuntu VPS; served the frontend through Nginx and reverse-proxied API traffic to the Go service.</w:t>
-      </w:r>
-    </w:p>
-    <w:p>
-      <w:pPr>
-        <w:pStyle w:val="ListBullet"/>
-        <w:spacing w:after="40" w:line="245" w:lineRule="auto"/>
-        <w:ind w:left="259" w:hanging="173"/>
-      </w:pPr>
-      <w:r>
-        <w:rPr>
-          <w:rFonts w:ascii="Arial" w:hAnsi="Arial"/>
-          <w:color w:val="111111"/>
-          <w:sz w:val="18"/>
-        </w:rPr>
-        <w:t>Managed the API with systemd, configured HTTPS with Let's Encrypt, and operated the MySQL-backed application; diagnosed and fixed a concurrent rate-limiter map-write failure.</w:t>
-      </w:r>
-    </w:p>
-    <w:p>
-      <w:pPr>
-        <w:keepNext/>
-        <w:spacing w:before="40" w:after="50" w:line="245" w:lineRule="auto"/>
-      </w:pPr>
-      <w:r>
-        <w:rPr>
-          <w:rFonts w:ascii="Arial" w:hAnsi="Arial"/>
-          <w:b/>
-          <w:color w:val="111111"/>
-          <w:sz w:val="19"/>
-        </w:rPr>
-        <w:t>AWS DevOps Automation Platform | Hands-on project repository | AWS, Terraform, Kubernetes, GitHub Actions</w:t>
-      </w:r>
-    </w:p>
-    <w:p>
-      <w:pPr>
-        <w:pStyle w:val="ListBullet"/>
-        <w:spacing w:after="40" w:line="245" w:lineRule="auto"/>
-        <w:ind w:left="259" w:hanging="173"/>
-      </w:pPr>
-      <w:r>
-        <w:rPr>
-          <w:rFonts w:ascii="Arial" w:hAnsi="Arial"/>
-          <w:color w:val="111111"/>
-          <w:sz w:val="18"/>
-        </w:rPr>
-        <w:t>Built practical projects covering AWS VPC and infrastructure automation, Jenkins high availability, container deployments, observability with Prometheus/Grafana, and GitHub Actions OIDC authentication.</w:t>
-      </w:r>
-    </w:p>
-    <w:p>
-      <w:pPr>
-        <w:keepNext/>
-        <w:spacing w:before="120" w:after="50" w:line="245" w:lineRule="auto"/>
-        <w:pBdr>
-          <w:bottom w:val="single" w:sz="4" w:space="1" w:color="DCE6E0"/>
-        </w:pBdr>
-      </w:pPr>
-      <w:r>
-        <w:rPr>
-          <w:rFonts w:ascii="Arial" w:hAnsi="Arial"/>
-          <w:b/>
-          <w:color w:val="111111"/>
-          <w:sz w:val="21"/>
-        </w:rPr>
-        <w:t>EDUCATION</w:t>
-      </w:r>
-    </w:p>
-    <w:p>
-      <w:pPr>
-        <w:spacing w:line="245" w:lineRule="auto" w:after="50"/>
-      </w:pPr>
-      <w:r>
-        <w:rPr>
-          <w:rFonts w:ascii="Arial" w:hAnsi="Arial"/>
-          <w:b/>
-          <w:color w:val="111111"/>
-          <w:sz w:val="18"/>
+          <w:sz w:val="20"/>
         </w:rPr>
         <w:t>B.Sc. in Computer Science</w:t>
       </w:r>
       <w:r>
         <w:rPr>
           <w:rFonts w:ascii="Arial" w:hAnsi="Arial"/>
+          <w:b w:val="0"/>
           <w:color w:val="111111"/>
-          <w:sz w:val="18"/>
+          <w:sz w:val="19"/>
         </w:rPr>
-        <w:t xml:space="preserve"> | Medha Degree College, affiliated with Yogi Vemana University | Kadapa | Aug 2021 - Jun 2024</w:t>
+        <w:t xml:space="preserve">  |  Medha Degree College (Yogi Vemana University)  |  Kadapa  |  Aug 2021 - Jun 2024</w:t>
       </w:r>
     </w:p>
     <w:sectPr>
       <w:pgSz w:w="12240" w:h="15840"/>
-      <w:pgMar w:top="680" w:right="893" w:bottom="680" w:left="893" w:header="720" w:footer="720" w:gutter="0"/>
+      <w:pgMar w:top="720" w:right="893" w:bottom="720" w:left="893" w:header="720" w:footer="720" w:gutter="0"/>
       <w:cols w:space="720"/>
       <w:docGrid w:linePitch="360"/>
     </w:sectPr>
@@ -881,12 +916,12 @@
     <w:qFormat/>
     <w:rsid w:val="00FC693F"/>
     <w:pPr>
-      <w:spacing w:after="40" w:line="240" w:lineRule="auto"/>
+      <w:spacing w:after="50" w:line="250" w:lineRule="auto"/>
     </w:pPr>
     <w:rPr>
       <w:rFonts w:ascii="Arial" w:hAnsi="Arial"/>
-      <w:color w:val="17212F"/>
-      <w:sz w:val="18"/>
+      <w:color w:val="111111"/>
+      <w:sz w:val="20"/>
     </w:rPr>
   </w:style>
   <w:style w:type="paragraph" w:styleId="Header">

</xml_diff>

<commit_message>
refactor: enhance portfolio design with updated content and improved color contrast
</commit_message>
<xml_diff>
--- a/assets/resume/Vajid_Shaik_DevOps_Engineer_Resume.docx
+++ b/assets/resume/Vajid_Shaik_DevOps_Engineer_Resume.docx
@@ -11,7 +11,7 @@
           <w:rFonts w:ascii="Arial" w:hAnsi="Arial"/>
           <w:b/>
           <w:color w:val="111111"/>
-          <w:sz w:val="54"/>
+          <w:sz w:val="56"/>
         </w:rPr>
         <w:t>VAJID SHAIK</w:t>
       </w:r>
@@ -84,7 +84,7 @@
           <w:color w:val="111111"/>
           <w:sz w:val="20"/>
         </w:rPr>
-        <w:t>DevOps Engineer with hands-on experience building CI/CD workflows for multi-service Java applications and supporting AWS infrastructure and Linux deployments. Automated build-to-deployment workflows, reducing deployment time by 70%. Skilled in GitHub Actions, Jenkins, AWS, Terraform, Docker, Kubernetes, and production operations.</w:t>
+        <w:t>DevOps Engineer with hands-on experience supporting CI/CD for multi-service Java applications, AWS infrastructure, and Linux deployments. Automated build-to-deployment workflows to reduce manual release steps and improve consistency. Experienced with GitHub Actions, Jenkins, Terraform, AWS, Docker, Kubernetes, and production troubleshooting.</w:t>
       </w:r>
     </w:p>
     <w:p>
@@ -114,7 +114,7 @@
           <w:rFonts w:ascii="Arial" w:hAnsi="Arial"/>
           <w:b/>
           <w:color w:val="111111"/>
-          <w:sz w:val="19"/>
+          <w:sz w:val="20"/>
         </w:rPr>
         <w:t xml:space="preserve">Cloud and networking: </w:t>
       </w:r>
@@ -123,7 +123,7 @@
           <w:rFonts w:ascii="Arial" w:hAnsi="Arial"/>
           <w:b w:val="0"/>
           <w:color w:val="111111"/>
-          <w:sz w:val="19"/>
+          <w:sz w:val="20"/>
         </w:rPr>
         <w:t>AWS (EC2, S3, IAM, VPC, Security Groups), Nginx, SSL, load balancing</w:t>
       </w:r>
@@ -137,18 +137,18 @@
           <w:rFonts w:ascii="Arial" w:hAnsi="Arial"/>
           <w:b/>
           <w:color w:val="111111"/>
-          <w:sz w:val="19"/>
+          <w:sz w:val="20"/>
         </w:rPr>
-        <w:t xml:space="preserve">CI/CD: </w:t>
+        <w:t xml:space="preserve">CI/CD and automation: </w:t>
       </w:r>
       <w:r>
         <w:rPr>
           <w:rFonts w:ascii="Arial" w:hAnsi="Arial"/>
           <w:b w:val="0"/>
           <w:color w:val="111111"/>
-          <w:sz w:val="19"/>
+          <w:sz w:val="20"/>
         </w:rPr>
-        <w:t>GitHub Actions, Jenkins, build automation, artifact storage and deployment workflows</w:t>
+        <w:t>GitHub Actions, Jenkins, Bash, systemd, artifact storage and deployment workflows</w:t>
       </w:r>
     </w:p>
     <w:p>
@@ -160,7 +160,7 @@
           <w:rFonts w:ascii="Arial" w:hAnsi="Arial"/>
           <w:b/>
           <w:color w:val="111111"/>
-          <w:sz w:val="19"/>
+          <w:sz w:val="20"/>
         </w:rPr>
         <w:t xml:space="preserve">Infrastructure as code: </w:t>
       </w:r>
@@ -169,7 +169,7 @@
           <w:rFonts w:ascii="Arial" w:hAnsi="Arial"/>
           <w:b w:val="0"/>
           <w:color w:val="111111"/>
-          <w:sz w:val="19"/>
+          <w:sz w:val="20"/>
         </w:rPr>
         <w:t>Terraform, Ansible, version-controlled infrastructure</w:t>
       </w:r>
@@ -183,7 +183,7 @@
           <w:rFonts w:ascii="Arial" w:hAnsi="Arial"/>
           <w:b/>
           <w:color w:val="111111"/>
-          <w:sz w:val="19"/>
+          <w:sz w:val="20"/>
         </w:rPr>
         <w:t xml:space="preserve">Containers and orchestration: </w:t>
       </w:r>
@@ -192,9 +192,9 @@
           <w:rFonts w:ascii="Arial" w:hAnsi="Arial"/>
           <w:b w:val="0"/>
           <w:color w:val="111111"/>
-          <w:sz w:val="19"/>
+          <w:sz w:val="20"/>
         </w:rPr>
-        <w:t>Docker, Kubernetes, Deployments, Services, Ingress, rolling updates, replica scaling</w:t>
+        <w:t>Docker, Kubernetes (Deployments, Services, Ingress, rolling updates, replica scaling)</w:t>
       </w:r>
     </w:p>
     <w:p>
@@ -206,7 +206,7 @@
           <w:rFonts w:ascii="Arial" w:hAnsi="Arial"/>
           <w:b/>
           <w:color w:val="111111"/>
-          <w:sz w:val="19"/>
+          <w:sz w:val="20"/>
         </w:rPr>
         <w:t xml:space="preserve">Systems and scripting: </w:t>
       </w:r>
@@ -215,7 +215,7 @@
           <w:rFonts w:ascii="Arial" w:hAnsi="Arial"/>
           <w:b w:val="0"/>
           <w:color w:val="111111"/>
-          <w:sz w:val="19"/>
+          <w:sz w:val="20"/>
         </w:rPr>
         <w:t>Linux (Ubuntu), Bash, systemd, Git</w:t>
       </w:r>
@@ -229,7 +229,7 @@
           <w:rFonts w:ascii="Arial" w:hAnsi="Arial"/>
           <w:b/>
           <w:color w:val="111111"/>
-          <w:sz w:val="19"/>
+          <w:sz w:val="20"/>
         </w:rPr>
         <w:t xml:space="preserve">Data and monitoring: </w:t>
       </w:r>
@@ -238,7 +238,7 @@
           <w:rFonts w:ascii="Arial" w:hAnsi="Arial"/>
           <w:b w:val="0"/>
           <w:color w:val="111111"/>
-          <w:sz w:val="19"/>
+          <w:sz w:val="20"/>
         </w:rPr>
         <w:t>MySQL, MongoDB, Redis, log monitoring, Prometheus, Grafana</w:t>
       </w:r>
@@ -286,14 +286,14 @@
           <w:rFonts w:ascii="Arial" w:hAnsi="Arial"/>
           <w:b w:val="0"/>
           <w:color w:val="111111"/>
-          <w:sz w:val="19"/>
+          <w:sz w:val="20"/>
         </w:rPr>
         <w:t>Zerocode Innovations Pvt Ltd  |  Hyderabad, India  |  Dec 2024 - Present</w:t>
       </w:r>
     </w:p>
     <w:p>
       <w:pPr>
-        <w:spacing w:after="52" w:line="250" w:lineRule="auto"/>
+        <w:spacing w:after="50" w:line="250" w:lineRule="auto"/>
         <w:ind w:left="288" w:hanging="259"/>
       </w:pPr>
       <w:r>
@@ -301,14 +301,14 @@
           <w:rFonts w:ascii="Arial" w:hAnsi="Arial"/>
           <w:b w:val="0"/>
           <w:color w:val="111111"/>
-          <w:sz w:val="19"/>
+          <w:sz w:val="20"/>
         </w:rPr>
         <w:t>- Build and maintain GitHub Actions and Jenkins pipelines for multi-service Java WAR applications, automating builds, artifact storage in Amazon S3, and deployments across multiple servers.</w:t>
       </w:r>
     </w:p>
     <w:p>
       <w:pPr>
-        <w:spacing w:after="52" w:line="250" w:lineRule="auto"/>
+        <w:spacing w:after="50" w:line="250" w:lineRule="auto"/>
         <w:ind w:left="288" w:hanging="259"/>
       </w:pPr>
       <w:r>
@@ -316,14 +316,14 @@
           <w:rFonts w:ascii="Arial" w:hAnsi="Arial"/>
           <w:b w:val="0"/>
           <w:color w:val="111111"/>
-          <w:sz w:val="19"/>
+          <w:sz w:val="20"/>
         </w:rPr>
-        <w:t>- Automated the build-to-deployment workflow, reducing deployment time by 70% and minimizing manual configuration errors.</w:t>
+        <w:t>- Automated build-to-deployment workflows to reduce manual release steps and improve deployment consistency.</w:t>
       </w:r>
     </w:p>
     <w:p>
       <w:pPr>
-        <w:spacing w:after="52" w:line="250" w:lineRule="auto"/>
+        <w:spacing w:after="50" w:line="250" w:lineRule="auto"/>
         <w:ind w:left="288" w:hanging="259"/>
       </w:pPr>
       <w:r>
@@ -331,14 +331,14 @@
           <w:rFonts w:ascii="Arial" w:hAnsi="Arial"/>
           <w:b w:val="0"/>
           <w:color w:val="111111"/>
-          <w:sz w:val="19"/>
+          <w:sz w:val="20"/>
         </w:rPr>
         <w:t>- Manage AWS infrastructure including EC2, S3, IAM, VPC, and Security Groups; maintain repeatable provisioning with version-controlled Terraform configurations.</w:t>
       </w:r>
     </w:p>
     <w:p>
       <w:pPr>
-        <w:spacing w:after="52" w:line="250" w:lineRule="auto"/>
+        <w:spacing w:after="50" w:line="250" w:lineRule="auto"/>
         <w:ind w:left="288" w:hanging="259"/>
       </w:pPr>
       <w:r>
@@ -346,14 +346,14 @@
           <w:rFonts w:ascii="Arial" w:hAnsi="Arial"/>
           <w:b w:val="0"/>
           <w:color w:val="111111"/>
-          <w:sz w:val="19"/>
+          <w:sz w:val="20"/>
         </w:rPr>
         <w:t>- Configure Nginx reverse proxy, SSL, and load balancing; support Linux deployments and services using Bash and systemd.</w:t>
       </w:r>
     </w:p>
     <w:p>
       <w:pPr>
-        <w:spacing w:after="52" w:line="250" w:lineRule="auto"/>
+        <w:spacing w:after="50" w:line="250" w:lineRule="auto"/>
         <w:ind w:left="288" w:hanging="259"/>
       </w:pPr>
       <w:r>
@@ -361,14 +361,14 @@
           <w:rFonts w:ascii="Arial" w:hAnsi="Arial"/>
           <w:b w:val="0"/>
           <w:color w:val="111111"/>
-          <w:sz w:val="19"/>
+          <w:sz w:val="20"/>
         </w:rPr>
         <w:t>- Containerize applications with Docker and deploy workloads to Kubernetes using Deployments, Services, and Ingress; perform rolling updates and replica scaling.</w:t>
       </w:r>
     </w:p>
     <w:p>
       <w:pPr>
-        <w:spacing w:after="52" w:line="250" w:lineRule="auto"/>
+        <w:spacing w:after="50" w:line="250" w:lineRule="auto"/>
         <w:ind w:left="288" w:hanging="259"/>
       </w:pPr>
       <w:r>
@@ -376,7 +376,7 @@
           <w:rFonts w:ascii="Arial" w:hAnsi="Arial"/>
           <w:b w:val="0"/>
           <w:color w:val="111111"/>
-          <w:sz w:val="19"/>
+          <w:sz w:val="20"/>
         </w:rPr>
         <w:t>- Administer MySQL, MongoDB, and Redis in staging and production; monitor logs and troubleshoot deployment and application issues.</w:t>
       </w:r>
@@ -411,12 +411,12 @@
           <w:color w:val="111111"/>
           <w:sz w:val="20"/>
         </w:rPr>
-        <w:t>BlogCMS - Full-stack application deployment | Go, Vue.js, MySQL, Nginx, Ubuntu Linux</w:t>
+        <w:t>BlogCMS - full-stack application and deployment | Go, Vue.js, MySQL, Nginx, systemd, Ubuntu Linux</w:t>
       </w:r>
     </w:p>
     <w:p>
       <w:pPr>
-        <w:spacing w:after="52" w:line="250" w:lineRule="auto"/>
+        <w:spacing w:after="50" w:line="250" w:lineRule="auto"/>
         <w:ind w:left="288" w:hanging="259"/>
       </w:pPr>
       <w:r>
@@ -424,14 +424,14 @@
           <w:rFonts w:ascii="Arial" w:hAnsi="Arial"/>
           <w:b w:val="0"/>
           <w:color w:val="111111"/>
-          <w:sz w:val="19"/>
+          <w:sz w:val="20"/>
         </w:rPr>
-        <w:t>- Deployed the Go API and Vue frontend to an Ubuntu VPS; configured Nginx to serve the static frontend and reverse-proxy API traffic.</w:t>
+        <w:t>- Built and deployed the Go API and Vue frontend to an Ubuntu VPS; configured Nginx to serve static files and reverse-proxy API requests, systemd to manage the API, and HTTPS with Let's Encrypt.</w:t>
       </w:r>
     </w:p>
     <w:p>
       <w:pPr>
-        <w:spacing w:after="52" w:line="250" w:lineRule="auto"/>
+        <w:spacing w:after="50" w:line="250" w:lineRule="auto"/>
         <w:ind w:left="288" w:hanging="259"/>
       </w:pPr>
       <w:r>
@@ -439,29 +439,14 @@
           <w:rFonts w:ascii="Arial" w:hAnsi="Arial"/>
           <w:b w:val="0"/>
           <w:color w:val="111111"/>
-          <w:sz w:val="19"/>
+          <w:sz w:val="20"/>
         </w:rPr>
-        <w:t>- Managed the API with systemd, configured HTTPS with Let's Encrypt, and operated the MySQL-backed application.</w:t>
+        <w:t>- Diagnosed and fixed a concurrent map-write failure in the Go API rate limiter.</w:t>
       </w:r>
     </w:p>
     <w:p>
       <w:pPr>
-        <w:keepNext/>
-        <w:spacing w:before="60" w:after="40"/>
-      </w:pPr>
-      <w:r>
-        <w:rPr>
-          <w:rFonts w:ascii="Arial" w:hAnsi="Arial"/>
-          <w:b/>
-          <w:color w:val="111111"/>
-          <w:sz w:val="20"/>
-        </w:rPr>
-        <w:t>Kubernetes application deployment | Docker, Kubernetes, YAML, kubectl</w:t>
-      </w:r>
-    </w:p>
-    <w:p>
-      <w:pPr>
-        <w:spacing w:after="52" w:line="250" w:lineRule="auto"/>
+        <w:spacing w:after="50" w:line="250" w:lineRule="auto"/>
         <w:ind w:left="288" w:hanging="259"/>
       </w:pPr>
       <w:r>
@@ -469,9 +454,9 @@
           <w:rFonts w:ascii="Arial" w:hAnsi="Arial"/>
           <w:b w:val="0"/>
           <w:color w:val="111111"/>
-          <w:sz w:val="19"/>
+          <w:sz w:val="20"/>
         </w:rPr>
-        <w:t>- Deployed a containerized application to Kubernetes using Deployments, Services, and Ingress; configured rolling updates and replica scaling and verified pod recovery behavior.</w:t>
+        <w:t>- Planned next phase: containerize the API and frontend with Docker and deploy the application to Kubernetes. This phase is not yet complete.</w:t>
       </w:r>
     </w:p>
     <w:p>
@@ -491,7 +476,7 @@
     </w:p>
     <w:p>
       <w:pPr>
-        <w:spacing w:after="52" w:line="250" w:lineRule="auto"/>
+        <w:spacing w:after="50" w:line="250" w:lineRule="auto"/>
         <w:ind w:left="288" w:hanging="259"/>
       </w:pPr>
       <w:r>
@@ -499,9 +484,9 @@
           <w:rFonts w:ascii="Arial" w:hAnsi="Arial"/>
           <w:b w:val="0"/>
           <w:color w:val="111111"/>
-          <w:sz w:val="19"/>
+          <w:sz w:val="20"/>
         </w:rPr>
-        <w:t>- Hands-on project repository covering AWS VPC automation, Jenkins high availability, container deployment, observability, and GitHub Actions OIDC authentication.</w:t>
+        <w:t>- Hands-on repository covering AWS VPC automation, Jenkins high availability, container deployment, observability, and GitHub Actions OIDC authentication.</w:t>
       </w:r>
     </w:p>
     <w:p>
@@ -537,14 +522,14 @@
           <w:rFonts w:ascii="Arial" w:hAnsi="Arial"/>
           <w:b w:val="0"/>
           <w:color w:val="111111"/>
-          <w:sz w:val="19"/>
+          <w:sz w:val="20"/>
         </w:rPr>
         <w:t xml:space="preserve">  |  Medha Degree College (Yogi Vemana University)  |  Kadapa  |  Aug 2021 - Jun 2024</w:t>
       </w:r>
     </w:p>
     <w:sectPr>
       <w:pgSz w:w="12240" w:h="15840"/>
-      <w:pgMar w:top="720" w:right="893" w:bottom="720" w:left="893" w:header="720" w:footer="720" w:gutter="0"/>
+      <w:pgMar w:top="605" w:right="893" w:bottom="605" w:left="893" w:header="720" w:footer="720" w:gutter="0"/>
       <w:cols w:space="720"/>
       <w:docGrid w:linePitch="360"/>
     </w:sectPr>

</xml_diff>

<commit_message>
Polish portfolio branding and BlogCMS project
</commit_message>
<xml_diff>
--- a/assets/resume/Vajid_Shaik_DevOps_Engineer_Resume.docx
+++ b/assets/resume/Vajid_Shaik_DevOps_Engineer_Resume.docx
@@ -61,7 +61,7 @@
     <w:p>
       <w:pPr>
         <w:keepNext/>
-        <w:spacing w:before="160" w:after="60"/>
+        <w:spacing w:before="140" w:after="60"/>
         <w:pBdr>
           <w:bottom w:val="single" w:sz="5" w:space="2" w:color="777777"/>
         </w:pBdr>
@@ -71,7 +71,7 @@
           <w:rFonts w:ascii="Arial" w:hAnsi="Arial"/>
           <w:b/>
           <w:color w:val="111111"/>
-          <w:sz w:val="23"/>
+          <w:sz w:val="22"/>
         </w:rPr>
         <w:t>PROFESSIONAL SUMMARY</w:t>
       </w:r>
@@ -90,7 +90,7 @@
     <w:p>
       <w:pPr>
         <w:keepNext/>
-        <w:spacing w:before="160" w:after="60"/>
+        <w:spacing w:before="140" w:after="60"/>
         <w:pBdr>
           <w:bottom w:val="single" w:sz="5" w:space="2" w:color="777777"/>
         </w:pBdr>
@@ -100,21 +100,21 @@
           <w:rFonts w:ascii="Arial" w:hAnsi="Arial"/>
           <w:b/>
           <w:color w:val="111111"/>
-          <w:sz w:val="23"/>
+          <w:sz w:val="22"/>
         </w:rPr>
         <w:t>TECHNICAL SKILLS</w:t>
       </w:r>
     </w:p>
     <w:p>
       <w:pPr>
-        <w:spacing w:after="30"/>
+        <w:spacing w:after="28"/>
       </w:pPr>
       <w:r>
         <w:rPr>
           <w:rFonts w:ascii="Arial" w:hAnsi="Arial"/>
           <w:b/>
           <w:color w:val="111111"/>
-          <w:sz w:val="20"/>
+          <w:sz w:val="19"/>
         </w:rPr>
         <w:t xml:space="preserve">Cloud and networking: </w:t>
       </w:r>
@@ -123,21 +123,21 @@
           <w:rFonts w:ascii="Arial" w:hAnsi="Arial"/>
           <w:b w:val="0"/>
           <w:color w:val="111111"/>
-          <w:sz w:val="20"/>
+          <w:sz w:val="19"/>
         </w:rPr>
         <w:t>AWS (EC2, S3, IAM, VPC, Security Groups), Nginx, SSL, load balancing</w:t>
       </w:r>
     </w:p>
     <w:p>
       <w:pPr>
-        <w:spacing w:after="30"/>
+        <w:spacing w:after="28"/>
       </w:pPr>
       <w:r>
         <w:rPr>
           <w:rFonts w:ascii="Arial" w:hAnsi="Arial"/>
           <w:b/>
           <w:color w:val="111111"/>
-          <w:sz w:val="20"/>
+          <w:sz w:val="19"/>
         </w:rPr>
         <w:t xml:space="preserve">CI/CD and automation: </w:t>
       </w:r>
@@ -146,21 +146,21 @@
           <w:rFonts w:ascii="Arial" w:hAnsi="Arial"/>
           <w:b w:val="0"/>
           <w:color w:val="111111"/>
-          <w:sz w:val="20"/>
+          <w:sz w:val="19"/>
         </w:rPr>
         <w:t>GitHub Actions, Jenkins, Bash, systemd, artifact storage and deployment workflows</w:t>
       </w:r>
     </w:p>
     <w:p>
       <w:pPr>
-        <w:spacing w:after="30"/>
+        <w:spacing w:after="28"/>
       </w:pPr>
       <w:r>
         <w:rPr>
           <w:rFonts w:ascii="Arial" w:hAnsi="Arial"/>
           <w:b/>
           <w:color w:val="111111"/>
-          <w:sz w:val="20"/>
+          <w:sz w:val="19"/>
         </w:rPr>
         <w:t xml:space="preserve">Infrastructure as code: </w:t>
       </w:r>
@@ -169,21 +169,21 @@
           <w:rFonts w:ascii="Arial" w:hAnsi="Arial"/>
           <w:b w:val="0"/>
           <w:color w:val="111111"/>
-          <w:sz w:val="20"/>
+          <w:sz w:val="19"/>
         </w:rPr>
         <w:t>Terraform, Ansible, version-controlled infrastructure</w:t>
       </w:r>
     </w:p>
     <w:p>
       <w:pPr>
-        <w:spacing w:after="30"/>
+        <w:spacing w:after="28"/>
       </w:pPr>
       <w:r>
         <w:rPr>
           <w:rFonts w:ascii="Arial" w:hAnsi="Arial"/>
           <w:b/>
           <w:color w:val="111111"/>
-          <w:sz w:val="20"/>
+          <w:sz w:val="19"/>
         </w:rPr>
         <w:t xml:space="preserve">Containers and orchestration: </w:t>
       </w:r>
@@ -192,21 +192,21 @@
           <w:rFonts w:ascii="Arial" w:hAnsi="Arial"/>
           <w:b w:val="0"/>
           <w:color w:val="111111"/>
-          <w:sz w:val="20"/>
+          <w:sz w:val="19"/>
         </w:rPr>
         <w:t>Docker, Kubernetes (Deployments, Services, Ingress, rolling updates, replica scaling)</w:t>
       </w:r>
     </w:p>
     <w:p>
       <w:pPr>
-        <w:spacing w:after="30"/>
+        <w:spacing w:after="28"/>
       </w:pPr>
       <w:r>
         <w:rPr>
           <w:rFonts w:ascii="Arial" w:hAnsi="Arial"/>
           <w:b/>
           <w:color w:val="111111"/>
-          <w:sz w:val="20"/>
+          <w:sz w:val="19"/>
         </w:rPr>
         <w:t xml:space="preserve">Systems and scripting: </w:t>
       </w:r>
@@ -215,21 +215,21 @@
           <w:rFonts w:ascii="Arial" w:hAnsi="Arial"/>
           <w:b w:val="0"/>
           <w:color w:val="111111"/>
-          <w:sz w:val="20"/>
+          <w:sz w:val="19"/>
         </w:rPr>
         <w:t>Linux (Ubuntu), Bash, systemd, Git</w:t>
       </w:r>
     </w:p>
     <w:p>
       <w:pPr>
-        <w:spacing w:after="30"/>
+        <w:spacing w:after="28"/>
       </w:pPr>
       <w:r>
         <w:rPr>
           <w:rFonts w:ascii="Arial" w:hAnsi="Arial"/>
           <w:b/>
           <w:color w:val="111111"/>
-          <w:sz w:val="20"/>
+          <w:sz w:val="19"/>
         </w:rPr>
         <w:t xml:space="preserve">Data and monitoring: </w:t>
       </w:r>
@@ -238,7 +238,7 @@
           <w:rFonts w:ascii="Arial" w:hAnsi="Arial"/>
           <w:b w:val="0"/>
           <w:color w:val="111111"/>
-          <w:sz w:val="20"/>
+          <w:sz w:val="19"/>
         </w:rPr>
         <w:t>MySQL, MongoDB, Redis, log monitoring, Prometheus, Grafana</w:t>
       </w:r>
@@ -246,7 +246,7 @@
     <w:p>
       <w:pPr>
         <w:keepNext/>
-        <w:spacing w:before="160" w:after="60"/>
+        <w:spacing w:before="140" w:after="60"/>
         <w:pBdr>
           <w:bottom w:val="single" w:sz="5" w:space="2" w:color="777777"/>
         </w:pBdr>
@@ -256,7 +256,7 @@
           <w:rFonts w:ascii="Arial" w:hAnsi="Arial"/>
           <w:b/>
           <w:color w:val="111111"/>
-          <w:sz w:val="23"/>
+          <w:sz w:val="22"/>
         </w:rPr>
         <w:t>PROFESSIONAL EXPERIENCE</w:t>
       </w:r>
@@ -279,21 +279,21 @@
     <w:p>
       <w:pPr>
         <w:keepNext/>
-        <w:spacing w:after="80"/>
+        <w:spacing w:after="60"/>
       </w:pPr>
       <w:r>
         <w:rPr>
           <w:rFonts w:ascii="Arial" w:hAnsi="Arial"/>
           <w:b w:val="0"/>
           <w:color w:val="111111"/>
-          <w:sz w:val="20"/>
+          <w:sz w:val="19"/>
         </w:rPr>
         <w:t>Zerocode Innovations Pvt Ltd  |  Hyderabad, India  |  Dec 2024 - Present</w:t>
       </w:r>
     </w:p>
     <w:p>
       <w:pPr>
-        <w:spacing w:after="50" w:line="250" w:lineRule="auto"/>
+        <w:spacing w:after="40" w:line="247" w:lineRule="auto"/>
         <w:ind w:left="288" w:hanging="259"/>
       </w:pPr>
       <w:r>
@@ -301,14 +301,14 @@
           <w:rFonts w:ascii="Arial" w:hAnsi="Arial"/>
           <w:b w:val="0"/>
           <w:color w:val="111111"/>
-          <w:sz w:val="20"/>
+          <w:sz w:val="19"/>
         </w:rPr>
         <w:t>- Build and maintain GitHub Actions and Jenkins pipelines for multi-service Java WAR applications, automating builds, artifact storage in Amazon S3, and deployments across multiple servers.</w:t>
       </w:r>
     </w:p>
     <w:p>
       <w:pPr>
-        <w:spacing w:after="50" w:line="250" w:lineRule="auto"/>
+        <w:spacing w:after="40" w:line="247" w:lineRule="auto"/>
         <w:ind w:left="288" w:hanging="259"/>
       </w:pPr>
       <w:r>
@@ -316,14 +316,14 @@
           <w:rFonts w:ascii="Arial" w:hAnsi="Arial"/>
           <w:b w:val="0"/>
           <w:color w:val="111111"/>
-          <w:sz w:val="20"/>
+          <w:sz w:val="19"/>
         </w:rPr>
         <w:t>- Automated build-to-deployment workflows to reduce manual release steps and improve deployment consistency.</w:t>
       </w:r>
     </w:p>
     <w:p>
       <w:pPr>
-        <w:spacing w:after="50" w:line="250" w:lineRule="auto"/>
+        <w:spacing w:after="40" w:line="247" w:lineRule="auto"/>
         <w:ind w:left="288" w:hanging="259"/>
       </w:pPr>
       <w:r>
@@ -331,14 +331,14 @@
           <w:rFonts w:ascii="Arial" w:hAnsi="Arial"/>
           <w:b w:val="0"/>
           <w:color w:val="111111"/>
-          <w:sz w:val="20"/>
+          <w:sz w:val="19"/>
         </w:rPr>
         <w:t>- Manage AWS infrastructure including EC2, S3, IAM, VPC, and Security Groups; maintain repeatable provisioning with version-controlled Terraform configurations.</w:t>
       </w:r>
     </w:p>
     <w:p>
       <w:pPr>
-        <w:spacing w:after="50" w:line="250" w:lineRule="auto"/>
+        <w:spacing w:after="40" w:line="247" w:lineRule="auto"/>
         <w:ind w:left="288" w:hanging="259"/>
       </w:pPr>
       <w:r>
@@ -346,14 +346,14 @@
           <w:rFonts w:ascii="Arial" w:hAnsi="Arial"/>
           <w:b w:val="0"/>
           <w:color w:val="111111"/>
-          <w:sz w:val="20"/>
+          <w:sz w:val="19"/>
         </w:rPr>
         <w:t>- Configure Nginx reverse proxy, SSL, and load balancing; support Linux deployments and services using Bash and systemd.</w:t>
       </w:r>
     </w:p>
     <w:p>
       <w:pPr>
-        <w:spacing w:after="50" w:line="250" w:lineRule="auto"/>
+        <w:spacing w:after="40" w:line="247" w:lineRule="auto"/>
         <w:ind w:left="288" w:hanging="259"/>
       </w:pPr>
       <w:r>
@@ -361,14 +361,14 @@
           <w:rFonts w:ascii="Arial" w:hAnsi="Arial"/>
           <w:b w:val="0"/>
           <w:color w:val="111111"/>
-          <w:sz w:val="20"/>
+          <w:sz w:val="19"/>
         </w:rPr>
         <w:t>- Containerize applications with Docker and deploy workloads to Kubernetes using Deployments, Services, and Ingress; perform rolling updates and replica scaling.</w:t>
       </w:r>
     </w:p>
     <w:p>
       <w:pPr>
-        <w:spacing w:after="50" w:line="250" w:lineRule="auto"/>
+        <w:spacing w:after="40" w:line="247" w:lineRule="auto"/>
         <w:ind w:left="288" w:hanging="259"/>
       </w:pPr>
       <w:r>
@@ -376,7 +376,7 @@
           <w:rFonts w:ascii="Arial" w:hAnsi="Arial"/>
           <w:b w:val="0"/>
           <w:color w:val="111111"/>
-          <w:sz w:val="20"/>
+          <w:sz w:val="19"/>
         </w:rPr>
         <w:t>- Administer MySQL, MongoDB, and Redis in staging and production; monitor logs and troubleshoot deployment and application issues.</w:t>
       </w:r>
@@ -384,7 +384,7 @@
     <w:p>
       <w:pPr>
         <w:keepNext/>
-        <w:spacing w:before="160" w:after="60"/>
+        <w:spacing w:before="140" w:after="60"/>
         <w:pBdr>
           <w:bottom w:val="single" w:sz="5" w:space="2" w:color="777777"/>
         </w:pBdr>
@@ -394,7 +394,7 @@
           <w:rFonts w:ascii="Arial" w:hAnsi="Arial"/>
           <w:b/>
           <w:color w:val="111111"/>
-          <w:sz w:val="23"/>
+          <w:sz w:val="22"/>
         </w:rPr>
         <w:t>PROJECTS</w:t>
       </w:r>
@@ -402,7 +402,7 @@
     <w:p>
       <w:pPr>
         <w:keepNext/>
-        <w:spacing w:before="60" w:after="40"/>
+        <w:spacing w:before="40" w:after="20"/>
       </w:pPr>
       <w:r>
         <w:rPr>
@@ -411,12 +411,12 @@
           <w:color w:val="111111"/>
           <w:sz w:val="20"/>
         </w:rPr>
-        <w:t>BlogCMS - full-stack application and deployment | Go, Vue.js, MySQL, Nginx, systemd, Ubuntu Linux</w:t>
+        <w:t>BlogCMS - full-stack application development and VPS deployment | Go, Vue.js, MySQL, Nginx, systemd, Ubuntu Linux</w:t>
       </w:r>
     </w:p>
     <w:p>
       <w:pPr>
-        <w:spacing w:after="50" w:line="250" w:lineRule="auto"/>
+        <w:spacing w:after="40" w:line="247" w:lineRule="auto"/>
         <w:ind w:left="288" w:hanging="259"/>
       </w:pPr>
       <w:r>
@@ -424,14 +424,14 @@
           <w:rFonts w:ascii="Arial" w:hAnsi="Arial"/>
           <w:b w:val="0"/>
           <w:color w:val="111111"/>
-          <w:sz w:val="20"/>
+          <w:sz w:val="19"/>
         </w:rPr>
-        <w:t>- Built and deployed the Go API and Vue frontend to an Ubuntu VPS; configured Nginx to serve static files and reverse-proxy API requests, systemd to manage the API, and HTTPS with Let's Encrypt.</w:t>
+        <w:t>- Built and deployed the Go API and Vue frontend to an Ubuntu VPS; configured Nginx to serve the frontend and reverse-proxy API requests.</w:t>
       </w:r>
     </w:p>
     <w:p>
       <w:pPr>
-        <w:spacing w:after="50" w:line="250" w:lineRule="auto"/>
+        <w:spacing w:after="40" w:line="247" w:lineRule="auto"/>
         <w:ind w:left="288" w:hanging="259"/>
       </w:pPr>
       <w:r>
@@ -439,14 +439,14 @@
           <w:rFonts w:ascii="Arial" w:hAnsi="Arial"/>
           <w:b w:val="0"/>
           <w:color w:val="111111"/>
-          <w:sz w:val="20"/>
+          <w:sz w:val="19"/>
         </w:rPr>
-        <w:t>- Diagnosed and fixed a concurrent map-write failure in the Go API rate limiter.</w:t>
+        <w:t>- Managed the API as a systemd service, configured HTTPS with Let's Encrypt, and operated the MySQL-backed application.</w:t>
       </w:r>
     </w:p>
     <w:p>
       <w:pPr>
-        <w:spacing w:after="50" w:line="250" w:lineRule="auto"/>
+        <w:spacing w:after="40" w:line="247" w:lineRule="auto"/>
         <w:ind w:left="288" w:hanging="259"/>
       </w:pPr>
       <w:r>
@@ -454,15 +454,15 @@
           <w:rFonts w:ascii="Arial" w:hAnsi="Arial"/>
           <w:b w:val="0"/>
           <w:color w:val="111111"/>
-          <w:sz w:val="20"/>
+          <w:sz w:val="19"/>
         </w:rPr>
-        <w:t>- Planned next phase: containerize the API and frontend with Docker and deploy the application to Kubernetes. This phase is not yet complete.</w:t>
+        <w:t>- Diagnosed and fixed a concurrent map-write failure in the Go API rate limiter.</w:t>
       </w:r>
     </w:p>
     <w:p>
       <w:pPr>
         <w:keepNext/>
-        <w:spacing w:before="60" w:after="40"/>
+        <w:spacing w:before="40" w:after="20"/>
       </w:pPr>
       <w:r>
         <w:rPr>
@@ -476,7 +476,7 @@
     </w:p>
     <w:p>
       <w:pPr>
-        <w:spacing w:after="50" w:line="250" w:lineRule="auto"/>
+        <w:spacing w:after="40" w:line="247" w:lineRule="auto"/>
         <w:ind w:left="288" w:hanging="259"/>
       </w:pPr>
       <w:r>
@@ -484,7 +484,7 @@
           <w:rFonts w:ascii="Arial" w:hAnsi="Arial"/>
           <w:b w:val="0"/>
           <w:color w:val="111111"/>
-          <w:sz w:val="20"/>
+          <w:sz w:val="19"/>
         </w:rPr>
         <w:t>- Hands-on repository covering AWS VPC automation, Jenkins high availability, container deployment, observability, and GitHub Actions OIDC authentication.</w:t>
       </w:r>
@@ -492,7 +492,7 @@
     <w:p>
       <w:pPr>
         <w:keepNext/>
-        <w:spacing w:before="160" w:after="60"/>
+        <w:spacing w:before="140" w:after="60"/>
         <w:pBdr>
           <w:bottom w:val="single" w:sz="5" w:space="2" w:color="777777"/>
         </w:pBdr>
@@ -502,7 +502,7 @@
           <w:rFonts w:ascii="Arial" w:hAnsi="Arial"/>
           <w:b/>
           <w:color w:val="111111"/>
-          <w:sz w:val="23"/>
+          <w:sz w:val="22"/>
         </w:rPr>
         <w:t>EDUCATION</w:t>
       </w:r>
@@ -522,7 +522,7 @@
           <w:rFonts w:ascii="Arial" w:hAnsi="Arial"/>
           <w:b w:val="0"/>
           <w:color w:val="111111"/>
-          <w:sz w:val="20"/>
+          <w:sz w:val="19"/>
         </w:rPr>
         <w:t xml:space="preserve">  |  Medha Degree College (Yogi Vemana University)  |  Kadapa  |  Aug 2021 - Jun 2024</w:t>
       </w:r>
@@ -901,12 +901,12 @@
     <w:qFormat/>
     <w:rsid w:val="00FC693F"/>
     <w:pPr>
-      <w:spacing w:after="50" w:line="250" w:lineRule="auto"/>
+      <w:spacing w:after="44" w:line="247" w:lineRule="auto"/>
     </w:pPr>
     <w:rPr>
       <w:rFonts w:ascii="Arial" w:hAnsi="Arial"/>
       <w:color w:val="111111"/>
-      <w:sz w:val="20"/>
+      <w:sz w:val="19"/>
     </w:rPr>
   </w:style>
   <w:style w:type="paragraph" w:styleId="Header">

</xml_diff>

<commit_message>
Clarify BlogCMS DevOps deployment experience
Co-authored-by: Copilot <223556219+Copilot@users.noreply.github.com>
</commit_message>
<xml_diff>
--- a/assets/resume/Vajid_Shaik_DevOps_Engineer_Resume.docx
+++ b/assets/resume/Vajid_Shaik_DevOps_Engineer_Resume.docx
@@ -11,21 +11,21 @@
           <w:rFonts w:ascii="Arial" w:hAnsi="Arial"/>
           <w:b/>
           <w:color w:val="111111"/>
-          <w:sz w:val="56"/>
+          <w:sz w:val="54"/>
         </w:rPr>
         <w:t>VAJID SHAIK</w:t>
       </w:r>
     </w:p>
     <w:p>
       <w:pPr>
-        <w:spacing w:after="100"/>
+        <w:spacing w:after="80"/>
       </w:pPr>
       <w:r>
         <w:rPr>
           <w:rFonts w:ascii="Arial" w:hAnsi="Arial"/>
           <w:b/>
           <w:color w:val="111111"/>
-          <w:sz w:val="24"/>
+          <w:sz w:val="23"/>
         </w:rPr>
         <w:t>DEVOPS ENGINEER</w:t>
       </w:r>
@@ -71,7 +71,7 @@
           <w:rFonts w:ascii="Arial" w:hAnsi="Arial"/>
           <w:b/>
           <w:color w:val="111111"/>
-          <w:sz w:val="22"/>
+          <w:sz w:val="21"/>
         </w:rPr>
         <w:t>PROFESSIONAL SUMMARY</w:t>
       </w:r>
@@ -82,9 +82,9 @@
           <w:rFonts w:ascii="Arial" w:hAnsi="Arial"/>
           <w:b w:val="0"/>
           <w:color w:val="111111"/>
-          <w:sz w:val="20"/>
+          <w:sz w:val="19"/>
         </w:rPr>
-        <w:t>DevOps Engineer with hands-on experience supporting CI/CD for multi-service Java applications, AWS infrastructure, and Linux deployments. Automated build-to-deployment workflows to reduce manual release steps and improve consistency. Experienced with GitHub Actions, Jenkins, Terraform, AWS, Docker, Kubernetes, and production troubleshooting.</w:t>
+        <w:t>DevOps Engineer with experience supporting CI/CD for Java applications, AWS infrastructure, and Linux deployments. Hands-on with GitHub Actions, Jenkins, Terraform, Docker, Kubernetes, Nginx, and production operations. Focused on reliable releases, repeatable infrastructure, and clear operational practices.</w:t>
       </w:r>
     </w:p>
     <w:p>
@@ -100,21 +100,21 @@
           <w:rFonts w:ascii="Arial" w:hAnsi="Arial"/>
           <w:b/>
           <w:color w:val="111111"/>
-          <w:sz w:val="22"/>
+          <w:sz w:val="21"/>
         </w:rPr>
         <w:t>TECHNICAL SKILLS</w:t>
       </w:r>
     </w:p>
     <w:p>
       <w:pPr>
-        <w:spacing w:after="28"/>
+        <w:spacing w:after="24"/>
       </w:pPr>
       <w:r>
         <w:rPr>
           <w:rFonts w:ascii="Arial" w:hAnsi="Arial"/>
           <w:b/>
           <w:color w:val="111111"/>
-          <w:sz w:val="19"/>
+          <w:sz w:val="18"/>
         </w:rPr>
         <w:t xml:space="preserve">Cloud and networking: </w:t>
       </w:r>
@@ -123,21 +123,21 @@
           <w:rFonts w:ascii="Arial" w:hAnsi="Arial"/>
           <w:b w:val="0"/>
           <w:color w:val="111111"/>
-          <w:sz w:val="19"/>
+          <w:sz w:val="18"/>
         </w:rPr>
         <w:t>AWS (EC2, S3, IAM, VPC, Security Groups), Nginx, SSL, load balancing</w:t>
       </w:r>
     </w:p>
     <w:p>
       <w:pPr>
-        <w:spacing w:after="28"/>
+        <w:spacing w:after="24"/>
       </w:pPr>
       <w:r>
         <w:rPr>
           <w:rFonts w:ascii="Arial" w:hAnsi="Arial"/>
           <w:b/>
           <w:color w:val="111111"/>
-          <w:sz w:val="19"/>
+          <w:sz w:val="18"/>
         </w:rPr>
         <w:t xml:space="preserve">CI/CD and automation: </w:t>
       </w:r>
@@ -146,21 +146,21 @@
           <w:rFonts w:ascii="Arial" w:hAnsi="Arial"/>
           <w:b w:val="0"/>
           <w:color w:val="111111"/>
-          <w:sz w:val="19"/>
+          <w:sz w:val="18"/>
         </w:rPr>
         <w:t>GitHub Actions, Jenkins, Bash, systemd, artifact storage and deployment workflows</w:t>
       </w:r>
     </w:p>
     <w:p>
       <w:pPr>
-        <w:spacing w:after="28"/>
+        <w:spacing w:after="24"/>
       </w:pPr>
       <w:r>
         <w:rPr>
           <w:rFonts w:ascii="Arial" w:hAnsi="Arial"/>
           <w:b/>
           <w:color w:val="111111"/>
-          <w:sz w:val="19"/>
+          <w:sz w:val="18"/>
         </w:rPr>
         <w:t xml:space="preserve">Infrastructure as code: </w:t>
       </w:r>
@@ -169,21 +169,21 @@
           <w:rFonts w:ascii="Arial" w:hAnsi="Arial"/>
           <w:b w:val="0"/>
           <w:color w:val="111111"/>
-          <w:sz w:val="19"/>
+          <w:sz w:val="18"/>
         </w:rPr>
         <w:t>Terraform, Ansible, version-controlled infrastructure</w:t>
       </w:r>
     </w:p>
     <w:p>
       <w:pPr>
-        <w:spacing w:after="28"/>
+        <w:spacing w:after="24"/>
       </w:pPr>
       <w:r>
         <w:rPr>
           <w:rFonts w:ascii="Arial" w:hAnsi="Arial"/>
           <w:b/>
           <w:color w:val="111111"/>
-          <w:sz w:val="19"/>
+          <w:sz w:val="18"/>
         </w:rPr>
         <w:t xml:space="preserve">Containers and orchestration: </w:t>
       </w:r>
@@ -192,21 +192,21 @@
           <w:rFonts w:ascii="Arial" w:hAnsi="Arial"/>
           <w:b w:val="0"/>
           <w:color w:val="111111"/>
-          <w:sz w:val="19"/>
+          <w:sz w:val="18"/>
         </w:rPr>
         <w:t>Docker, Kubernetes (Deployments, Services, Ingress, rolling updates, replica scaling)</w:t>
       </w:r>
     </w:p>
     <w:p>
       <w:pPr>
-        <w:spacing w:after="28"/>
+        <w:spacing w:after="24"/>
       </w:pPr>
       <w:r>
         <w:rPr>
           <w:rFonts w:ascii="Arial" w:hAnsi="Arial"/>
           <w:b/>
           <w:color w:val="111111"/>
-          <w:sz w:val="19"/>
+          <w:sz w:val="18"/>
         </w:rPr>
         <w:t xml:space="preserve">Systems and scripting: </w:t>
       </w:r>
@@ -215,21 +215,21 @@
           <w:rFonts w:ascii="Arial" w:hAnsi="Arial"/>
           <w:b w:val="0"/>
           <w:color w:val="111111"/>
-          <w:sz w:val="19"/>
+          <w:sz w:val="18"/>
         </w:rPr>
         <w:t>Linux (Ubuntu), Bash, systemd, Git</w:t>
       </w:r>
     </w:p>
     <w:p>
       <w:pPr>
-        <w:spacing w:after="28"/>
+        <w:spacing w:after="24"/>
       </w:pPr>
       <w:r>
         <w:rPr>
           <w:rFonts w:ascii="Arial" w:hAnsi="Arial"/>
           <w:b/>
           <w:color w:val="111111"/>
-          <w:sz w:val="19"/>
+          <w:sz w:val="18"/>
         </w:rPr>
         <w:t xml:space="preserve">Data and monitoring: </w:t>
       </w:r>
@@ -238,7 +238,7 @@
           <w:rFonts w:ascii="Arial" w:hAnsi="Arial"/>
           <w:b w:val="0"/>
           <w:color w:val="111111"/>
-          <w:sz w:val="19"/>
+          <w:sz w:val="18"/>
         </w:rPr>
         <w:t>MySQL, MongoDB, Redis, log monitoring, Prometheus, Grafana</w:t>
       </w:r>
@@ -256,7 +256,7 @@
           <w:rFonts w:ascii="Arial" w:hAnsi="Arial"/>
           <w:b/>
           <w:color w:val="111111"/>
-          <w:sz w:val="22"/>
+          <w:sz w:val="21"/>
         </w:rPr>
         <w:t>PROFESSIONAL EXPERIENCE</w:t>
       </w:r>
@@ -271,7 +271,7 @@
           <w:rFonts w:ascii="Arial" w:hAnsi="Arial"/>
           <w:b/>
           <w:color w:val="111111"/>
-          <w:sz w:val="21"/>
+          <w:sz w:val="20"/>
         </w:rPr>
         <w:t>DevOps Engineer (previously Trainee DevOps Engineer)</w:t>
       </w:r>
@@ -293,7 +293,7 @@
     </w:p>
     <w:p>
       <w:pPr>
-        <w:spacing w:after="40" w:line="247" w:lineRule="auto"/>
+        <w:spacing w:after="36" w:line="245" w:lineRule="auto"/>
         <w:ind w:left="288" w:hanging="259"/>
       </w:pPr>
       <w:r>
@@ -303,12 +303,12 @@
           <w:color w:val="111111"/>
           <w:sz w:val="19"/>
         </w:rPr>
-        <w:t>- Build and maintain GitHub Actions and Jenkins pipelines for multi-service Java WAR applications, automating builds, artifact storage in Amazon S3, and deployments across multiple servers.</w:t>
+        <w:t>- Build and maintain GitHub Actions and Jenkins pipelines for multi-service Java WAR applications, automating builds, Amazon S3 artifact storage, and deployments across multiple servers.</w:t>
       </w:r>
     </w:p>
     <w:p>
       <w:pPr>
-        <w:spacing w:after="40" w:line="247" w:lineRule="auto"/>
+        <w:spacing w:after="36" w:line="245" w:lineRule="auto"/>
         <w:ind w:left="288" w:hanging="259"/>
       </w:pPr>
       <w:r>
@@ -318,12 +318,12 @@
           <w:color w:val="111111"/>
           <w:sz w:val="19"/>
         </w:rPr>
-        <w:t>- Automated build-to-deployment workflows to reduce manual release steps and improve deployment consistency.</w:t>
+        <w:t>- Automated build-to-deployment workflows to reduce manual release steps and improve consistency.</w:t>
       </w:r>
     </w:p>
     <w:p>
       <w:pPr>
-        <w:spacing w:after="40" w:line="247" w:lineRule="auto"/>
+        <w:spacing w:after="36" w:line="245" w:lineRule="auto"/>
         <w:ind w:left="288" w:hanging="259"/>
       </w:pPr>
       <w:r>
@@ -338,7 +338,7 @@
     </w:p>
     <w:p>
       <w:pPr>
-        <w:spacing w:after="40" w:line="247" w:lineRule="auto"/>
+        <w:spacing w:after="36" w:line="245" w:lineRule="auto"/>
         <w:ind w:left="288" w:hanging="259"/>
       </w:pPr>
       <w:r>
@@ -353,7 +353,7 @@
     </w:p>
     <w:p>
       <w:pPr>
-        <w:spacing w:after="40" w:line="247" w:lineRule="auto"/>
+        <w:spacing w:after="36" w:line="245" w:lineRule="auto"/>
         <w:ind w:left="288" w:hanging="259"/>
       </w:pPr>
       <w:r>
@@ -368,7 +368,7 @@
     </w:p>
     <w:p>
       <w:pPr>
-        <w:spacing w:after="40" w:line="247" w:lineRule="auto"/>
+        <w:spacing w:after="36" w:line="245" w:lineRule="auto"/>
         <w:ind w:left="288" w:hanging="259"/>
       </w:pPr>
       <w:r>
@@ -394,9 +394,69 @@
           <w:rFonts w:ascii="Arial" w:hAnsi="Arial"/>
           <w:b/>
           <w:color w:val="111111"/>
-          <w:sz w:val="22"/>
+          <w:sz w:val="21"/>
         </w:rPr>
         <w:t>PROJECTS</w:t>
+      </w:r>
+    </w:p>
+    <w:p>
+      <w:pPr>
+        <w:keepNext/>
+        <w:spacing w:after="20"/>
+      </w:pPr>
+      <w:r>
+        <w:rPr>
+          <w:rFonts w:ascii="Arial" w:hAnsi="Arial"/>
+          <w:b/>
+          <w:color w:val="111111"/>
+          <w:sz w:val="19"/>
+        </w:rPr>
+        <w:t>BlogCMS - DevOps deployment and operations | Existing Go, Vue.js, and MySQL application | Nginx, systemd, Ubuntu Linux, HTTPS</w:t>
+      </w:r>
+    </w:p>
+    <w:p>
+      <w:pPr>
+        <w:spacing w:after="36" w:line="245" w:lineRule="auto"/>
+        <w:ind w:left="288" w:hanging="259"/>
+      </w:pPr>
+      <w:r>
+        <w:rPr>
+          <w:rFonts w:ascii="Arial" w:hAnsi="Arial"/>
+          <w:b w:val="0"/>
+          <w:color w:val="111111"/>
+          <w:sz w:val="19"/>
+        </w:rPr>
+        <w:t>- Deployed the existing application to an Ubuntu VPS, serving its static frontend with Nginx and reverse-proxying API requests to the Go service.</w:t>
+      </w:r>
+    </w:p>
+    <w:p>
+      <w:pPr>
+        <w:spacing w:after="36" w:line="245" w:lineRule="auto"/>
+        <w:ind w:left="288" w:hanging="259"/>
+      </w:pPr>
+      <w:r>
+        <w:rPr>
+          <w:rFonts w:ascii="Arial" w:hAnsi="Arial"/>
+          <w:b w:val="0"/>
+          <w:color w:val="111111"/>
+          <w:sz w:val="19"/>
+        </w:rPr>
+        <w:t>- Configured systemd to run and restart the API service, enabled HTTPS with Let's Encrypt, and operated the MySQL-backed production application.</w:t>
+      </w:r>
+    </w:p>
+    <w:p>
+      <w:pPr>
+        <w:spacing w:after="36" w:line="245" w:lineRule="auto"/>
+        <w:ind w:left="288" w:hanging="259"/>
+      </w:pPr>
+      <w:r>
+        <w:rPr>
+          <w:rFonts w:ascii="Arial" w:hAnsi="Arial"/>
+          <w:b w:val="0"/>
+          <w:color w:val="111111"/>
+          <w:sz w:val="19"/>
+        </w:rPr>
+        <w:t>- Managed deployment and service troubleshooting across the application, Nginx, Linux host, and database.</w:t>
       </w:r>
     </w:p>
     <w:p>
@@ -409,74 +469,14 @@
           <w:rFonts w:ascii="Arial" w:hAnsi="Arial"/>
           <w:b/>
           <w:color w:val="111111"/>
-          <w:sz w:val="20"/>
-        </w:rPr>
-        <w:t>BlogCMS - full-stack application development and VPS deployment | Go, Vue.js, MySQL, Nginx, systemd, Ubuntu Linux</w:t>
-      </w:r>
-    </w:p>
-    <w:p>
-      <w:pPr>
-        <w:spacing w:after="40" w:line="247" w:lineRule="auto"/>
-        <w:ind w:left="288" w:hanging="259"/>
-      </w:pPr>
-      <w:r>
-        <w:rPr>
-          <w:rFonts w:ascii="Arial" w:hAnsi="Arial"/>
-          <w:b w:val="0"/>
-          <w:color w:val="111111"/>
           <w:sz w:val="19"/>
-        </w:rPr>
-        <w:t>- Built and deployed the Go API and Vue frontend to an Ubuntu VPS; configured Nginx to serve the frontend and reverse-proxy API requests.</w:t>
-      </w:r>
-    </w:p>
-    <w:p>
-      <w:pPr>
-        <w:spacing w:after="40" w:line="247" w:lineRule="auto"/>
-        <w:ind w:left="288" w:hanging="259"/>
-      </w:pPr>
-      <w:r>
-        <w:rPr>
-          <w:rFonts w:ascii="Arial" w:hAnsi="Arial"/>
-          <w:b w:val="0"/>
-          <w:color w:val="111111"/>
-          <w:sz w:val="19"/>
-        </w:rPr>
-        <w:t>- Managed the API as a systemd service, configured HTTPS with Let's Encrypt, and operated the MySQL-backed application.</w:t>
-      </w:r>
-    </w:p>
-    <w:p>
-      <w:pPr>
-        <w:spacing w:after="40" w:line="247" w:lineRule="auto"/>
-        <w:ind w:left="288" w:hanging="259"/>
-      </w:pPr>
-      <w:r>
-        <w:rPr>
-          <w:rFonts w:ascii="Arial" w:hAnsi="Arial"/>
-          <w:b w:val="0"/>
-          <w:color w:val="111111"/>
-          <w:sz w:val="19"/>
-        </w:rPr>
-        <w:t>- Diagnosed and fixed a concurrent map-write failure in the Go API rate limiter.</w:t>
-      </w:r>
-    </w:p>
-    <w:p>
-      <w:pPr>
-        <w:keepNext/>
-        <w:spacing w:before="40" w:after="20"/>
-      </w:pPr>
-      <w:r>
-        <w:rPr>
-          <w:rFonts w:ascii="Arial" w:hAnsi="Arial"/>
-          <w:b/>
-          <w:color w:val="111111"/>
-          <w:sz w:val="20"/>
         </w:rPr>
         <w:t>AWS DevOps automation projects | AWS, Terraform, Jenkins, GitHub Actions, Prometheus, Grafana</w:t>
       </w:r>
     </w:p>
     <w:p>
       <w:pPr>
-        <w:spacing w:after="40" w:line="247" w:lineRule="auto"/>
+        <w:spacing w:after="36" w:line="245" w:lineRule="auto"/>
         <w:ind w:left="288" w:hanging="259"/>
       </w:pPr>
       <w:r>
@@ -502,7 +502,7 @@
           <w:rFonts w:ascii="Arial" w:hAnsi="Arial"/>
           <w:b/>
           <w:color w:val="111111"/>
-          <w:sz w:val="22"/>
+          <w:sz w:val="21"/>
         </w:rPr>
         <w:t>EDUCATION</w:t>
       </w:r>
@@ -513,7 +513,7 @@
           <w:rFonts w:ascii="Arial" w:hAnsi="Arial"/>
           <w:b/>
           <w:color w:val="111111"/>
-          <w:sz w:val="20"/>
+          <w:sz w:val="19"/>
         </w:rPr>
         <w:t>B.Sc. in Computer Science</w:t>
       </w:r>
@@ -901,7 +901,7 @@
     <w:qFormat/>
     <w:rsid w:val="00FC693F"/>
     <w:pPr>
-      <w:spacing w:after="44" w:line="247" w:lineRule="auto"/>
+      <w:spacing w:after="40" w:line="245" w:lineRule="auto"/>
     </w:pPr>
     <w:rPr>
       <w:rFonts w:ascii="Arial" w:hAnsi="Arial"/>

</xml_diff>

<commit_message>
Update BlogCMS DevOps portfolio and resume
Co-authored-by: Copilot <223556219+Copilot@users.noreply.github.com>
</commit_message>
<xml_diff>
--- a/assets/resume/Vajid_Shaik_DevOps_Engineer_Resume.docx
+++ b/assets/resume/Vajid_Shaik_DevOps_Engineer_Resume.docx
@@ -84,7 +84,7 @@
           <w:color w:val="111111"/>
           <w:sz w:val="19"/>
         </w:rPr>
-        <w:t>DevOps Engineer with experience supporting CI/CD for Java applications, AWS infrastructure, and Linux deployments. Hands-on with GitHub Actions, Jenkins, Terraform, Docker, Kubernetes, Nginx, and production operations. Focused on reliable releases, repeatable infrastructure, and clear operational practices.</w:t>
+        <w:t>DevOps Engineer with experience supporting CI/CD for Java applications, AWS infrastructure, and Linux deployments. Recently delivered a full-stack production deployment to single-node K3s with GitHub Actions CI, Trivy scanning, and GHCR publishing. Hands-on with Jenkins, Terraform, Docker, Kubernetes, Nginx, and production operations.</w:t>
       </w:r>
     </w:p>
     <w:p>
@@ -411,7 +411,7 @@
           <w:color w:val="111111"/>
           <w:sz w:val="19"/>
         </w:rPr>
-        <w:t>BlogCMS - DevOps deployment and operations | Existing Go, Vue.js, and MySQL application | Nginx, systemd, Ubuntu Linux, HTTPS</w:t>
+        <w:t>BlogCMS | CI/CD and Kubernetes deployment | Go, Vue.js, MySQL, GitHub Actions, Trivy, GHCR, K3s, Nginx</w:t>
       </w:r>
     </w:p>
     <w:p>
@@ -426,7 +426,7 @@
           <w:color w:val="111111"/>
           <w:sz w:val="19"/>
         </w:rPr>
-        <w:t>- Deployed the existing application to an Ubuntu VPS, serving its static frontend with Nginx and reverse-proxying API requests to the Go service.</w:t>
+        <w:t>- Added GitHub Actions checks for backend and frontend; built container images, scanned them with Trivy, and published verified images to GHCR.</w:t>
       </w:r>
     </w:p>
     <w:p>
@@ -441,7 +441,7 @@
           <w:color w:val="111111"/>
           <w:sz w:val="19"/>
         </w:rPr>
-        <w:t>- Configured systemd to run and restart the API service, enabled HTTPS with Let's Encrypt, and operated the MySQL-backed production application.</w:t>
+        <w:t>- Deployed the API and frontend to a single-node K3s cluster on Ubuntu, retaining host Nginx and Let's Encrypt for HTTPS routing.</w:t>
       </w:r>
     </w:p>
     <w:p>
@@ -456,7 +456,7 @@
           <w:color w:val="111111"/>
           <w:sz w:val="19"/>
         </w:rPr>
-        <w:t>- Managed deployment and service troubleshooting across the application, Nginx, Linux host, and database.</w:t>
+        <w:t>- Connected the workload to MySQL, reused persistent uploads, and verified the production rollout with healthy public endpoints.</w:t>
       </w:r>
     </w:p>
     <w:p>

</xml_diff>

<commit_message>
Expand resume layout and use black headings
Co-authored-by: Copilot <223556219+Copilot@users.noreply.github.com>
</commit_message>
<xml_diff>
--- a/assets/resume/Vajid_Shaik_DevOps_Engineer_Resume.docx
+++ b/assets/resume/Vajid_Shaik_DevOps_Engineer_Resume.docx
@@ -10,7 +10,7 @@
         <w:rPr>
           <w:rFonts w:ascii="Arial" w:hAnsi="Arial"/>
           <w:b/>
-          <w:color w:val="111111"/>
+          <w:color w:val="000000"/>
           <w:sz w:val="54"/>
         </w:rPr>
         <w:t>VAJID SHAIK</w:t>
@@ -24,7 +24,7 @@
         <w:rPr>
           <w:rFonts w:ascii="Arial" w:hAnsi="Arial"/>
           <w:b/>
-          <w:color w:val="111111"/>
+          <w:color w:val="000000"/>
           <w:sz w:val="23"/>
         </w:rPr>
         <w:t>DEVOPS ENGINEER</w:t>
@@ -38,7 +38,7 @@
         <w:rPr>
           <w:rFonts w:ascii="Arial" w:hAnsi="Arial"/>
           <w:b w:val="0"/>
-          <w:color w:val="111111"/>
+          <w:color w:val="000000"/>
           <w:sz w:val="19"/>
         </w:rPr>
         <w:t>Hyderabad, India  |  +91 9640781856  |  shaikvajid484@gmail.com</w:t>
@@ -52,7 +52,7 @@
         <w:rPr>
           <w:rFonts w:ascii="Arial" w:hAnsi="Arial"/>
           <w:b w:val="0"/>
-          <w:color w:val="111111"/>
+          <w:color w:val="000000"/>
           <w:sz w:val="19"/>
         </w:rPr>
         <w:t>LinkedIn: linkedin.com/in/vajid-shaik  |  GitHub: github.com/VajidShaik44  |  Portfolio: vajidshaik44.github.io</w:t>
@@ -70,7 +70,7 @@
         <w:rPr>
           <w:rFonts w:ascii="Arial" w:hAnsi="Arial"/>
           <w:b/>
-          <w:color w:val="111111"/>
+          <w:color w:val="000000"/>
           <w:sz w:val="21"/>
         </w:rPr>
         <w:t>PROFESSIONAL SUMMARY</w:t>
@@ -81,7 +81,7 @@
         <w:rPr>
           <w:rFonts w:ascii="Arial" w:hAnsi="Arial"/>
           <w:b w:val="0"/>
-          <w:color w:val="111111"/>
+          <w:color w:val="000000"/>
           <w:sz w:val="19"/>
         </w:rPr>
         <w:t>DevOps Engineer with experience supporting CI/CD for Java applications, AWS infrastructure, and Linux deployments. Recently delivered a full-stack production deployment to single-node K3s with GitHub Actions CI, Trivy scanning, and GHCR publishing. Hands-on with Jenkins, Terraform, Docker, Kubernetes, Nginx, and production operations.</w:t>
@@ -99,7 +99,7 @@
         <w:rPr>
           <w:rFonts w:ascii="Arial" w:hAnsi="Arial"/>
           <w:b/>
-          <w:color w:val="111111"/>
+          <w:color w:val="000000"/>
           <w:sz w:val="21"/>
         </w:rPr>
         <w:t>TECHNICAL SKILLS</w:t>
@@ -113,7 +113,7 @@
         <w:rPr>
           <w:rFonts w:ascii="Arial" w:hAnsi="Arial"/>
           <w:b/>
-          <w:color w:val="111111"/>
+          <w:color w:val="000000"/>
           <w:sz w:val="18"/>
         </w:rPr>
         <w:t xml:space="preserve">Cloud and networking: </w:t>
@@ -122,7 +122,7 @@
         <w:rPr>
           <w:rFonts w:ascii="Arial" w:hAnsi="Arial"/>
           <w:b w:val="0"/>
-          <w:color w:val="111111"/>
+          <w:color w:val="000000"/>
           <w:sz w:val="18"/>
         </w:rPr>
         <w:t>AWS (EC2, S3, IAM, VPC, Security Groups), Nginx, SSL, load balancing</w:t>
@@ -136,7 +136,7 @@
         <w:rPr>
           <w:rFonts w:ascii="Arial" w:hAnsi="Arial"/>
           <w:b/>
-          <w:color w:val="111111"/>
+          <w:color w:val="000000"/>
           <w:sz w:val="18"/>
         </w:rPr>
         <w:t xml:space="preserve">CI/CD and automation: </w:t>
@@ -145,7 +145,7 @@
         <w:rPr>
           <w:rFonts w:ascii="Arial" w:hAnsi="Arial"/>
           <w:b w:val="0"/>
-          <w:color w:val="111111"/>
+          <w:color w:val="000000"/>
           <w:sz w:val="18"/>
         </w:rPr>
         <w:t>GitHub Actions, Jenkins, Bash, systemd, artifact storage and deployment workflows</w:t>
@@ -159,7 +159,7 @@
         <w:rPr>
           <w:rFonts w:ascii="Arial" w:hAnsi="Arial"/>
           <w:b/>
-          <w:color w:val="111111"/>
+          <w:color w:val="000000"/>
           <w:sz w:val="18"/>
         </w:rPr>
         <w:t xml:space="preserve">Infrastructure as code: </w:t>
@@ -168,7 +168,7 @@
         <w:rPr>
           <w:rFonts w:ascii="Arial" w:hAnsi="Arial"/>
           <w:b w:val="0"/>
-          <w:color w:val="111111"/>
+          <w:color w:val="000000"/>
           <w:sz w:val="18"/>
         </w:rPr>
         <w:t>Terraform, Ansible, version-controlled infrastructure</w:t>
@@ -182,7 +182,7 @@
         <w:rPr>
           <w:rFonts w:ascii="Arial" w:hAnsi="Arial"/>
           <w:b/>
-          <w:color w:val="111111"/>
+          <w:color w:val="000000"/>
           <w:sz w:val="18"/>
         </w:rPr>
         <w:t xml:space="preserve">Containers and orchestration: </w:t>
@@ -191,7 +191,7 @@
         <w:rPr>
           <w:rFonts w:ascii="Arial" w:hAnsi="Arial"/>
           <w:b w:val="0"/>
-          <w:color w:val="111111"/>
+          <w:color w:val="000000"/>
           <w:sz w:val="18"/>
         </w:rPr>
         <w:t>Docker, Kubernetes (Deployments, Services, Ingress, rolling updates, replica scaling)</w:t>
@@ -205,7 +205,7 @@
         <w:rPr>
           <w:rFonts w:ascii="Arial" w:hAnsi="Arial"/>
           <w:b/>
-          <w:color w:val="111111"/>
+          <w:color w:val="000000"/>
           <w:sz w:val="18"/>
         </w:rPr>
         <w:t xml:space="preserve">Systems and scripting: </w:t>
@@ -214,7 +214,7 @@
         <w:rPr>
           <w:rFonts w:ascii="Arial" w:hAnsi="Arial"/>
           <w:b w:val="0"/>
-          <w:color w:val="111111"/>
+          <w:color w:val="000000"/>
           <w:sz w:val="18"/>
         </w:rPr>
         <w:t>Linux (Ubuntu), Bash, systemd, Git</w:t>
@@ -228,7 +228,7 @@
         <w:rPr>
           <w:rFonts w:ascii="Arial" w:hAnsi="Arial"/>
           <w:b/>
-          <w:color w:val="111111"/>
+          <w:color w:val="000000"/>
           <w:sz w:val="18"/>
         </w:rPr>
         <w:t xml:space="preserve">Data and monitoring: </w:t>
@@ -237,7 +237,7 @@
         <w:rPr>
           <w:rFonts w:ascii="Arial" w:hAnsi="Arial"/>
           <w:b w:val="0"/>
-          <w:color w:val="111111"/>
+          <w:color w:val="000000"/>
           <w:sz w:val="18"/>
         </w:rPr>
         <w:t>MySQL, MongoDB, Redis, log monitoring, Prometheus, Grafana</w:t>
@@ -255,7 +255,7 @@
         <w:rPr>
           <w:rFonts w:ascii="Arial" w:hAnsi="Arial"/>
           <w:b/>
-          <w:color w:val="111111"/>
+          <w:color w:val="000000"/>
           <w:sz w:val="21"/>
         </w:rPr>
         <w:t>PROFESSIONAL EXPERIENCE</w:t>
@@ -270,7 +270,7 @@
         <w:rPr>
           <w:rFonts w:ascii="Arial" w:hAnsi="Arial"/>
           <w:b/>
-          <w:color w:val="111111"/>
+          <w:color w:val="000000"/>
           <w:sz w:val="20"/>
         </w:rPr>
         <w:t>DevOps Engineer (previously Trainee DevOps Engineer)</w:t>
@@ -285,7 +285,7 @@
         <w:rPr>
           <w:rFonts w:ascii="Arial" w:hAnsi="Arial"/>
           <w:b w:val="0"/>
-          <w:color w:val="111111"/>
+          <w:color w:val="000000"/>
           <w:sz w:val="19"/>
         </w:rPr>
         <w:t>Zerocode Innovations Pvt Ltd  |  Hyderabad, India  |  Dec 2024 - Present</w:t>
@@ -300,7 +300,7 @@
         <w:rPr>
           <w:rFonts w:ascii="Arial" w:hAnsi="Arial"/>
           <w:b w:val="0"/>
-          <w:color w:val="111111"/>
+          <w:color w:val="000000"/>
           <w:sz w:val="19"/>
         </w:rPr>
         <w:t>- Build and maintain GitHub Actions and Jenkins pipelines for multi-service Java WAR applications, automating builds, Amazon S3 artifact storage, and deployments across multiple servers.</w:t>
@@ -315,7 +315,7 @@
         <w:rPr>
           <w:rFonts w:ascii="Arial" w:hAnsi="Arial"/>
           <w:b w:val="0"/>
-          <w:color w:val="111111"/>
+          <w:color w:val="000000"/>
           <w:sz w:val="19"/>
         </w:rPr>
         <w:t>- Automated build-to-deployment workflows to reduce manual release steps and improve consistency.</w:t>
@@ -330,7 +330,7 @@
         <w:rPr>
           <w:rFonts w:ascii="Arial" w:hAnsi="Arial"/>
           <w:b w:val="0"/>
-          <w:color w:val="111111"/>
+          <w:color w:val="000000"/>
           <w:sz w:val="19"/>
         </w:rPr>
         <w:t>- Manage AWS infrastructure including EC2, S3, IAM, VPC, and Security Groups; maintain repeatable provisioning with version-controlled Terraform configurations.</w:t>
@@ -345,7 +345,7 @@
         <w:rPr>
           <w:rFonts w:ascii="Arial" w:hAnsi="Arial"/>
           <w:b w:val="0"/>
-          <w:color w:val="111111"/>
+          <w:color w:val="000000"/>
           <w:sz w:val="19"/>
         </w:rPr>
         <w:t>- Configure Nginx reverse proxy, SSL, and load balancing; support Linux deployments and services using Bash and systemd.</w:t>
@@ -360,7 +360,7 @@
         <w:rPr>
           <w:rFonts w:ascii="Arial" w:hAnsi="Arial"/>
           <w:b w:val="0"/>
-          <w:color w:val="111111"/>
+          <w:color w:val="000000"/>
           <w:sz w:val="19"/>
         </w:rPr>
         <w:t>- Containerize applications with Docker and deploy workloads to Kubernetes using Deployments, Services, and Ingress; perform rolling updates and replica scaling.</w:t>
@@ -375,7 +375,7 @@
         <w:rPr>
           <w:rFonts w:ascii="Arial" w:hAnsi="Arial"/>
           <w:b w:val="0"/>
-          <w:color w:val="111111"/>
+          <w:color w:val="000000"/>
           <w:sz w:val="19"/>
         </w:rPr>
         <w:t>- Administer MySQL, MongoDB, and Redis in staging and production; monitor logs and troubleshoot deployment and application issues.</w:t>
@@ -393,7 +393,7 @@
         <w:rPr>
           <w:rFonts w:ascii="Arial" w:hAnsi="Arial"/>
           <w:b/>
-          <w:color w:val="111111"/>
+          <w:color w:val="000000"/>
           <w:sz w:val="21"/>
         </w:rPr>
         <w:t>PROJECTS</w:t>
@@ -408,7 +408,7 @@
         <w:rPr>
           <w:rFonts w:ascii="Arial" w:hAnsi="Arial"/>
           <w:b/>
-          <w:color w:val="111111"/>
+          <w:color w:val="000000"/>
           <w:sz w:val="19"/>
         </w:rPr>
         <w:t>BlogCMS | CI/CD and Kubernetes deployment | Go, Vue.js, MySQL, GitHub Actions, Trivy, GHCR, K3s, Nginx</w:t>
@@ -423,7 +423,7 @@
         <w:rPr>
           <w:rFonts w:ascii="Arial" w:hAnsi="Arial"/>
           <w:b w:val="0"/>
-          <w:color w:val="111111"/>
+          <w:color w:val="000000"/>
           <w:sz w:val="19"/>
         </w:rPr>
         <w:t>- Added GitHub Actions checks for backend and frontend; built container images, scanned them with Trivy, and published verified images to GHCR.</w:t>
@@ -438,7 +438,7 @@
         <w:rPr>
           <w:rFonts w:ascii="Arial" w:hAnsi="Arial"/>
           <w:b w:val="0"/>
-          <w:color w:val="111111"/>
+          <w:color w:val="000000"/>
           <w:sz w:val="19"/>
         </w:rPr>
         <w:t>- Deployed the API and frontend to a single-node K3s cluster on Ubuntu, retaining host Nginx and Let's Encrypt for HTTPS routing.</w:t>
@@ -453,7 +453,7 @@
         <w:rPr>
           <w:rFonts w:ascii="Arial" w:hAnsi="Arial"/>
           <w:b w:val="0"/>
-          <w:color w:val="111111"/>
+          <w:color w:val="000000"/>
           <w:sz w:val="19"/>
         </w:rPr>
         <w:t>- Connected the workload to MySQL, reused persistent uploads, and verified the production rollout with healthy public endpoints.</w:t>
@@ -468,7 +468,7 @@
         <w:rPr>
           <w:rFonts w:ascii="Arial" w:hAnsi="Arial"/>
           <w:b/>
-          <w:color w:val="111111"/>
+          <w:color w:val="000000"/>
           <w:sz w:val="19"/>
         </w:rPr>
         <w:t>AWS DevOps automation projects | AWS, Terraform, Jenkins, GitHub Actions, Prometheus, Grafana</w:t>
@@ -483,7 +483,7 @@
         <w:rPr>
           <w:rFonts w:ascii="Arial" w:hAnsi="Arial"/>
           <w:b w:val="0"/>
-          <w:color w:val="111111"/>
+          <w:color w:val="000000"/>
           <w:sz w:val="19"/>
         </w:rPr>
         <w:t>- Hands-on repository covering AWS VPC automation, Jenkins high availability, container deployment, observability, and GitHub Actions OIDC authentication.</w:t>
@@ -501,7 +501,7 @@
         <w:rPr>
           <w:rFonts w:ascii="Arial" w:hAnsi="Arial"/>
           <w:b/>
-          <w:color w:val="111111"/>
+          <w:color w:val="000000"/>
           <w:sz w:val="21"/>
         </w:rPr>
         <w:t>EDUCATION</w:t>
@@ -512,7 +512,7 @@
         <w:rPr>
           <w:rFonts w:ascii="Arial" w:hAnsi="Arial"/>
           <w:b/>
-          <w:color w:val="111111"/>
+          <w:color w:val="000000"/>
           <w:sz w:val="19"/>
         </w:rPr>
         <w:t>B.Sc. in Computer Science</w:t>
@@ -521,7 +521,7 @@
         <w:rPr>
           <w:rFonts w:ascii="Arial" w:hAnsi="Arial"/>
           <w:b w:val="0"/>
-          <w:color w:val="111111"/>
+          <w:color w:val="000000"/>
           <w:sz w:val="19"/>
         </w:rPr>
         <w:t xml:space="preserve">  |  Medha Degree College (Yogi Vemana University)  |  Kadapa  |  Aug 2021 - Jun 2024</w:t>

</xml_diff>

<commit_message>
Simplify resume role and project details
Co-authored-by: Copilot <223556219+Copilot@users.noreply.github.com>
</commit_message>
<xml_diff>
--- a/assets/resume/Vajid_Shaik_DevOps_Engineer_Resume.docx
+++ b/assets/resume/Vajid_Shaik_DevOps_Engineer_Resume.docx
@@ -273,7 +273,7 @@
           <w:color w:val="000000"/>
           <w:sz w:val="20"/>
         </w:rPr>
-        <w:t>DevOps Engineer (previously Trainee DevOps Engineer)</w:t>
+        <w:t>DevOps Engineer</w:t>
       </w:r>
     </w:p>
     <w:p>
@@ -486,7 +486,7 @@
           <w:color w:val="000000"/>
           <w:sz w:val="19"/>
         </w:rPr>
-        <w:t>- Hands-on repository covering AWS VPC automation, Jenkins high availability, container deployment, observability, and GitHub Actions OIDC authentication.</w:t>
+        <w:t>- Hands-on repository covering AWS VPC automation, Jenkins high availability, container deployment, and observability.</w:t>
       </w:r>
     </w:p>
     <w:p>

</xml_diff>

<commit_message>
Add resume metrics and BlogCMS live link
Co-authored-by: Copilot <223556219+Copilot@users.noreply.github.com>
</commit_message>
<xml_diff>
--- a/assets/resume/Vajid_Shaik_DevOps_Engineer_Resume.docx
+++ b/assets/resume/Vajid_Shaik_DevOps_Engineer_Resume.docx
@@ -318,7 +318,7 @@
           <w:color w:val="000000"/>
           <w:sz w:val="19"/>
         </w:rPr>
-        <w:t>- Automated build-to-deployment workflows to reduce manual release steps and improve consistency.</w:t>
+        <w:t>- Automated build-to-deployment workflows, reducing deployment time by approximately 40% compared with the previous manual process.</w:t>
       </w:r>
     </w:p>
     <w:p>
@@ -416,6 +416,28 @@
     </w:p>
     <w:p>
       <w:pPr>
+        <w:spacing w:after="30"/>
+      </w:pPr>
+      <w:r>
+        <w:rPr>
+          <w:rFonts w:ascii="Arial" w:hAnsi="Arial"/>
+          <w:color w:val="000000"/>
+          <w:sz w:val="18"/>
+        </w:rPr>
+        <w:t xml:space="preserve">Live application: </w:t>
+      </w:r>
+      <w:hyperlink r:id="rId9">
+        <w:r>
+          <w:rPr>
+            <w:color w:val="000000"/>
+            <w:u w:val="single"/>
+          </w:rPr>
+          <w:t>cmsapp.duckdns.org</w:t>
+        </w:r>
+      </w:hyperlink>
+    </w:p>
+    <w:p>
+      <w:pPr>
         <w:spacing w:after="36" w:line="245" w:lineRule="auto"/>
         <w:ind w:left="288" w:hanging="259"/>
       </w:pPr>
@@ -426,7 +448,7 @@
           <w:color w:val="000000"/>
           <w:sz w:val="19"/>
         </w:rPr>
-        <w:t>- Added GitHub Actions checks for backend and frontend; built container images, scanned them with Trivy, and published verified images to GHCR.</w:t>
+        <w:t>- Added GitHub Actions checks for backend and frontend; published verified GHCR images after Trivy scans reported 0 HIGH/CRITICAL findings.</w:t>
       </w:r>
     </w:p>
     <w:p>
@@ -441,7 +463,7 @@
           <w:color w:val="000000"/>
           <w:sz w:val="19"/>
         </w:rPr>
-        <w:t>- Deployed the API and frontend to a single-node K3s cluster on Ubuntu, retaining host Nginx and Let's Encrypt for HTTPS routing.</w:t>
+        <w:t>- Deployed two application workloads (API and frontend) to a single-node K3s cluster, retaining host Nginx and Let's Encrypt for HTTPS routing.</w:t>
       </w:r>
     </w:p>
     <w:p>
@@ -456,7 +478,7 @@
           <w:color w:val="000000"/>
           <w:sz w:val="19"/>
         </w:rPr>
-        <w:t>- Connected the workload to MySQL, reused persistent uploads, and verified the production rollout with healthy public endpoints.</w:t>
+        <w:t>- Connected the workloads to MySQL, reused persistent uploads, and verified public frontend and API readiness endpoints returned HTTP 200.</w:t>
       </w:r>
     </w:p>
     <w:p>

</xml_diff>